<commit_message>
Complete evidence-based host optimisation
</commit_message>
<xml_diff>
--- a/publication/G-Synth_Final_Master_Manuscript.docx
+++ b/publication/G-Synth_Final_Master_Manuscript.docx
@@ -87,7 +87,7 @@
     </w:p>
     <w:p>
       <w:r>
-        <w:t>Nucleic-acid design for synthesis is often fragmented across codon tools, restriction maps, plasmid editors and sequencing viewers, complicating proof that an ordered molecule is the one later cloned and assessed. We developed G-Synth, an open-source application and Python engine implementing host-selected codon optimization and two synthesis-centred workflows: Small Sequence Design (SSD) for one complementary oligonucleotide pair and Extended Sequence Design (ESD) for tiled, directional pairs. Both derive strand-specific restriction products and block release unless in-silico annealing and ordered ligation reconstruct both intended strands exactly. A staged Design→Hybridization→Restriction-cloning workflow exposes unpaired bases as cohesive ends in compact and nucleotide-level double-strand views, verifies complementarity with a digested vector and requires explicit ligation before product analysis. The same record supports editable annotation, PCR/digest/gel simulation and quality-aware Sanger validation. The separated engine, API and interface passed 1,098, 262 and 89 tests, respectively. In an experimentally grounded case study, SSD regenerated insulin glargine A- and B-chain constructs; all four oligonucleotides exactly matched archived synthesis records. NdeI/XhoI cloning into pET-21a(+) preserved the intended open reading frames and generated 5,490-bp and 5,523-bp recombinant plasmids. G-Synth assembled the four author-designated chromatograms into 100%-covered, 100%-identical consensus sequences. Bidirectional overlap was 56.1% for A and 71.2% for B, with 100% F/R agreement; independent Biopython analysis reproduced complete coverage and identity. The exact SSD/ESD release-gate combination was not identified in prior design-automation literature and is, to our knowledge, first automated and disclosed here. Protein expression, folding and bioactivity were not tested.</w:t>
+        <w:t>Nucleic-acid design for synthesis is often fragmented across codon tools, restriction maps, plasmid editors and sequencing viewers, complicating proof that an ordered molecule is the one later cloned and assessed. We developed G-Synth, an open-source application and Python engine implementing 15 source-traceable host codon profiles and two synthesis-centred workflows: Small Sequence Design (SSD) for one complementary oligonucleotide pair and Extended Sequence Design (ESD) for tiled, directional pairs. Both derive strand-specific restriction products and block release unless in-silico annealing and ordered ligation reconstruct both intended strands exactly. A staged Design→Hybridization→Restriction-cloning workflow exposes unpaired bases as cohesive ends in compact and nucleotide-level double-strand views, verifies complementarity with a digested vector and requires explicit ligation before product analysis. The same record supports peptide back-translation with explicit initiator handling, editable annotation, PCR/digest/gel simulation and quality-aware Sanger validation. The separated engine, API and interface passed 1,113, 265 and 91 tests, respectively. In an experimentally grounded case study, SSD regenerated insulin glargine A- and B-chain constructs; all four oligonucleotides exactly matched archived synthesis records. NdeI/XhoI cloning into pET-21a(+) preserved the intended open reading frames and generated 5,490-bp and 5,523-bp recombinant plasmids. G-Synth assembled the four author-designated chromatograms into 100%-covered, 100%-identical consensus sequences. Bidirectional overlap was 56.1% for A and 71.2% for B, with 100% F/R agreement; independent Biopython analysis reproduced complete coverage and identity. The exact SSD/ESD release-gate combination was not identified in prior design-automation literature and is, to our knowledge, first automated and disclosed here. Protein expression, folding and bioactivity were not tested.</w:t>
       </w:r>
     </w:p>
     <w:p>
@@ -190,7 +190,12 @@
     </w:p>
     <w:p>
       <w:r>
-        <w:t>Codon optimization is explicitly conditioned on the selected expression host. The bundled profiles cover Escherichia coli, Saccharomyces cerevisiae, Komagataella phaffii, Bacillus subtilis, Homo sapiens, Cricetulus griseus, Spodoptera frugiperda and Nicotiana benthamiana. Species-wide coding frequencies are normalized within each synonymous family; the E. coli default retains the Sharp–Li high-expression reference used to define CAI [81,82]. Every candidate is translated after optimization, and amino-acid identity is a blocking invariant. Because codon preference is strain-, tissue- and cell-line-dependent and cannot alone predict expression, G-Synth exposes the exact table source and accepts a documented user reference-gene set for context-specific analysis [81–83].</w:t>
+        <w:t>Codon optimization is explicitly conditioned on the selected expression host. Fifteen profiles cover bacterial (Escherichia coli, Bacillus subtilis, Pseudomonas putida, Lactococcus lactis, Corynebacterium glutamicum and Streptomyces coelicolor), yeast (Saccharomyces cerevisiae, Komagataella phaffii, Kluyveromyces lactis and Yarrowia lipolytica), mammalian (human and Chinese-hamster species proxies), insect (Spodoptera frugiperda and Drosophila melanogaster species proxies) and plant (Nicotiana benthamiana) systems. Each profile preserves all 64 raw codon counts, NCBI taxon, source dataset, sample size, GC and snapshot checksum. Counts from the September 2021 FDA HIVE-CUTs/CoCoPUTs release are normalized within each synonymous family [83,84]; RefSeq species aggregates are preferred, with a disclosed GenBank fallback when that snapshot lacks a RefSeq table. Every candidate is translated after optimization, and amino-acid identity is a blocking invariant. A species-wide result is labelled profile-relative CAI rather than strict CAI or predicted yield; a documented highly expressed reference-gene set can override it for strain-, tissue- or cell-line-specific analysis [82,85–87].</w:t>
+      </w:r>
+    </w:p>
+    <w:p>
+      <w:r>
+        <w:t>The same workflow accepts a peptide and performs host-conditioned reverse translation. Its start logic distinguishes the coding ORF from a mature or post-translationally processed product [88–90]. Automatic mode treats an N-terminal methionine as an existing initiator and otherwise preserves the supplied peptide as a mature product whose initiation is provided upstream by Design. Because sequence alone cannot establish biological maturity, the user may override this inference. Declaring a non-M peptide as a complete expression protein adds exactly one initiator methionine/ATG; declaring it mature never changes its residue sequence. The engine records the input peptide, resolved role and any added initiator, re-translates the generated DNA and transfers the corresponding coding-state flag to Design. It does not predict in-vivo methionine excision.</w:t>
       </w:r>
     </w:p>
     <w:p>
@@ -203,7 +208,7 @@
     </w:p>
     <w:p>
       <w:r>
-        <w:t>An enzyme is represented by its recognition sequence and top- and bottom-strand cut offsets, not by a prewritten tail. From these offsets the engine derives overhang sequence, length and 5′/3′ polarity for either end of a linear fragment. This matters because the bases that remain on a forward oligonucleotide depend on whether an enzyme is placed at the left or right end and on which strand is ordered. The current enzyme table contains 109 enzymes and is exercised in both terminal positions. HindIII, for example, is rendered from A|AGCTT / TTCGA|A cut coordinates and therefore appears with the correct 5′ cohesive end rather than being lost by a recognition-site-only search. The enzyme-table checksum is stored in provenance records.</w:t>
+        <w:t>An enzyme is represented by its recognition sequence and top- and bottom-strand cut offsets, not by a prewritten tail. From these offsets the engine derives overhang sequence, length and 5′/3′ polarity for either end of a linear fragment. This matters because the bases that remain on a forward oligonucleotide depend on whether an enzyme is placed at the left or right end and on which strand is ordered. The selectable table contains 109 non-redundant in-site cut geometries representing 289 commercially available enzyme names from REBASE; isoschizomers remain searchable aliases rather than duplicate map sites [75]. Every geometry is exercised in both terminal positions. HindIII, for example, is rendered from A|AGCTT / TTCGA|A cut coordinates and therefore appears with the correct 5′ cohesive end rather than being lost by a recognition-site-only search. Enzymes with ambiguous sites, out-of-site cleavage or two cuts are outside this model and are not claimed as supported. The enzyme-table checksum is stored in provenance records.</w:t>
       </w:r>
     </w:p>
     <w:p>
@@ -448,7 +453,7 @@
     </w:p>
     <w:p>
       <w:r>
-        <w:t>Validation combined unit, property, API and interface tests with a retrospective experimental case study. The engine suite contains golden examples, error-path tests, host-profile invariants, enzyme-wide properties and antiparallel-hybridization cases covering 5′/3′ overhangs, blunt ends, ambiguity, mismatches and thermodynamic reporting boundaries. The defining assembly property is equality between the intended construct and both strands reconstructed from the exported oligonucleotides. API tests cover request validation, host selection, serialization, authentication, projects, sequence import, hybridization, PCR and security. Interface tests cover the design and validation views, host-profile selection, automatic Design-to-Hybridization-to-Restriction-cloning handoff, simultaneous compact and nucleotide-level duplex evidence, editable annotations, primer-tail hybridization, gels, Learn content and responsive behaviour. The complete suites were executed from the manuscript working tree on 2 September 2026: 1,098/1,098 engine, 262/262 API and 89/89 interface tests passed.</w:t>
+        <w:t>Validation combined unit, property, API and interface tests with a retrospective experimental case study. The engine suite contains golden examples, error-path tests, host-profile invariants, peptide-start decisions, enzyme-wide properties and antiparallel-hybridization cases covering 5′/3′ overhangs, blunt ends, ambiguity, mismatches and thermodynamic reporting boundaries. The defining assembly property is equality between the intended construct and both strands reconstructed from the exported oligonucleotides. API tests cover request validation, host selection, peptide-to-DNA serialization, authentication, projects, sequence import, hybridization, PCR and security. Interface tests cover the design and validation views, host-profile and peptide-role selection, automatic Design-to-Hybridization-to-Restriction-cloning handoff, simultaneous compact and nucleotide-level duplex evidence, editable annotations, primer-tail hybridization, gels, Learn content and responsive behaviour. The complete suites were executed from the manuscript working tree on 2 September 2026: 1,113/1,113 engine, 265/265 API and 91/91 interface tests passed.</w:t>
       </w:r>
     </w:p>
     <w:tbl>
@@ -620,7 +625,7 @@
               <w:rPr>
                 <w:sz w:val="17"/>
               </w:rPr>
-              <w:t>1,098 passed</w:t>
+              <w:t>1,113 passed</w:t>
             </w:r>
           </w:p>
         </w:tc>
@@ -694,7 +699,7 @@
               <w:rPr>
                 <w:sz w:val="17"/>
               </w:rPr>
-              <w:t>262 passed</w:t>
+              <w:t>265 passed</w:t>
             </w:r>
           </w:p>
         </w:tc>
@@ -765,7 +770,7 @@
               <w:rPr>
                 <w:sz w:val="17"/>
               </w:rPr>
-              <w:t>89 passed</w:t>
+              <w:t>91 passed</w:t>
             </w:r>
           </w:p>
         </w:tc>
@@ -3280,7 +3285,7 @@
     </w:p>
     <w:p>
       <w:r>
-        <w:t>G-Synth formalizes Small Sequence Design and Extended Sequence Design as auditable synthesis-order workflows and carries the same digital molecule through host-selected codon optimization, oligonucleotide ordering, exact reconstruction, explicit hybridization, staged ligation, editable annotation, virtual PCR/digest/gel experiments and quality-aware post-sequencing review. The software passed 1,449 automated tests across its engine, API and interface. In the insulin glargine case study, SSD exactly regenerated all archived A/B oligonucleotides, produced coherent NdeI/XhoI recombinant pET-21a(+) designs and assembled the approved F/R chromatograms into 100%-covered, 100%-identical consensus sequences with perfect agreement in their bidirectional overlaps. The central contribution is not generic end-to-end software, but the first disclosed automation, to our knowledge, of the specifically defined SSD/ESD two-strand release gate and its continuity into post-sequencing evidence.</w:t>
+        <w:t>G-Synth formalizes Small Sequence Design and Extended Sequence Design as auditable synthesis-order workflows and carries the same digital molecule through peptide back-translation or host-selected codon optimization, oligonucleotide ordering, exact reconstruction, explicit hybridization, staged ligation, editable annotation, virtual PCR/digest/gel experiments and quality-aware post-sequencing review. The software passed 1,469 automated tests across its engine, API and interface. In the insulin glargine case study, SSD exactly regenerated all archived A/B oligonucleotides, produced coherent NdeI/XhoI recombinant pET-21a(+) designs and assembled the approved F/R chromatograms into 100%-covered, 100%-identical consensus sequences with perfect agreement in their bidirectional overlaps. The central contribution is not generic end-to-end software, but the first disclosed automation, to our knowledge, of the specifically defined SSD/ESD two-strand release gate and its continuity into post-sequencing evidence.</w:t>
       </w:r>
     </w:p>
     <w:p>
@@ -3302,6 +3307,16 @@
     <w:p>
       <w:r>
         <w:t>The design and cloning case study was executed with tools/publication/design_glargine_case_study.py. The script records the source-manuscript SHA-256 hash, regenerates the oligonucleotides, asserts exact equality with the archived Table 3 molecules, translates the cassette, simulates pET-21a(+) cloning and writes publication_evidence/glargine_ab_design_and_cloning.json. Trace reanalysis was executed with tools/publication/validate_insulin_correct_traces.py, which admits only the four author-designated files, hashes every reference and trace, constructs oriented G-Synth F/R consensus sequences, quantifies bidirectional overlap and agreement, performs an independent Biopython 1.87 local alignment and writes a JSON evidence record plus figure. Full commands are supplied in the Supporting Information.</w:t>
+      </w:r>
+    </w:p>
+    <w:p>
+      <w:r>
+        <w:t>The codon profiles were reconstructed with tools/update_hive_codon_tables.py from FDA HIVE service object 537 and committed as gsynth_engine/data/codon_usage_hive_2021.json. The updater requests genomic species data with descendant taxa, prefers RefSeq and falls back to GenBank only for K. phaffii and N. benthamiana, validates the returned taxon, requires exactly 64 non-negative codon counts and checks that their sum equals the reported total. The application divides each raw count by the maximum count among synonymous codons for that amino acid. The shipped September 2021 snapshot was retrieved on 2 September 2026 and is identified by SHA-256 in the API. Because these are species-wide genomic profiles rather than prespecified highly expressed genes, the geometric-mean score is reported as profile-relative CAI. No expression-yield inference is made. The machine-readable validation record publication_evidence/codon_host_profile_validation.json confirms 15 complete and numerically distinct 64-codon weight vectors and preservation of a 100-residue benchmark protein under every profile.</w:t>
+      </w:r>
+    </w:p>
+    <w:p>
+      <w:r>
+        <w:t>Peptide-start and restriction-catalogue checks were regenerated with tools/publication/validate_peptide_and_enzyme_logic.py. The resulting publication_evidence/peptide_and_enzyme_validation.json records four automatic and overridden peptide-role cases, host-wise reverse translation of the mature glargine A chain, translation hashes, the 109/289 geometry-to-name inventory and the independently derived HindIII 5′-AGCT end. The mature chain remained unchanged and did not receive an artificial ATG under all 15 host profiles; the complete-ORF override added exactly one initiator when required.</w:t>
       </w:r>
     </w:p>
     <w:p>
@@ -4482,6 +4497,90 @@
           <w:sz w:val="17"/>
         </w:rPr>
         <w:t>83. Alexaki, A.; Kames, J.; Holcomb, D. D.; et al. Codon and Codon-Pair Usage Tables (CoCoPUTs): Facilitating Genetic Variation Analyses and Recombinant Gene Design. J. Mol. Biol. 2019, 431, 2434–2441. https://doi.org/10.1016/j.jmb.2019.04.021.</w:t>
+      </w:r>
+    </w:p>
+    <w:p>
+      <w:pPr>
+        <w:spacing w:after="60" w:line="240" w:lineRule="auto"/>
+        <w:ind w:left="360" w:hanging="360"/>
+      </w:pPr>
+      <w:r>
+        <w:rPr>
+          <w:sz w:val="17"/>
+        </w:rPr>
+        <w:t>84. Athey, J.; Alexaki, A.; Osipova, E.; et al. A New and Updated Resource for Codon Usage Tables. BMC Bioinformatics 2017, 18, 391. https://doi.org/10.1186/s12859-017-1793-7.</w:t>
+      </w:r>
+    </w:p>
+    <w:p>
+      <w:pPr>
+        <w:spacing w:after="60" w:line="240" w:lineRule="auto"/>
+        <w:ind w:left="360" w:hanging="360"/>
+      </w:pPr>
+      <w:r>
+        <w:rPr>
+          <w:sz w:val="17"/>
+        </w:rPr>
+        <w:t>85. Ranaghan, M. J.; Li, J. J.; Laprise, D. M.; et al. Assessing Optimal: Inequalities in Codon Optimization Algorithms. BMC Biol. 2021, 19, 36. https://doi.org/10.1186/s12915-021-00968-8.</w:t>
+      </w:r>
+    </w:p>
+    <w:p>
+      <w:pPr>
+        <w:spacing w:after="60" w:line="240" w:lineRule="auto"/>
+        <w:ind w:left="360" w:hanging="360"/>
+      </w:pPr>
+      <w:r>
+        <w:rPr>
+          <w:sz w:val="17"/>
+        </w:rPr>
+        <w:t>86. Subramanian, K.; Payne, B.; Feyertag, F.; Alvarez-Ponce, D. The Codon Statistics Database: A Database of Codon Usage Bias. Mol. Biol. Evol. 2022, 39, msac157. https://doi.org/10.1093/molbev/msac157.</w:t>
+      </w:r>
+    </w:p>
+    <w:p>
+      <w:pPr>
+        <w:spacing w:after="60" w:line="240" w:lineRule="auto"/>
+        <w:ind w:left="360" w:hanging="360"/>
+      </w:pPr>
+      <w:r>
+        <w:rPr>
+          <w:sz w:val="17"/>
+        </w:rPr>
+        <w:t>87. O'Leary, N. A.; Wright, M. W.; Brister, J. R.; et al. Reference Sequence (RefSeq) Database at NCBI: Current Status, Taxonomic Expansion, and Functional Annotation. Nucleic Acids Res. 2016, 44, D733–D745. https://doi.org/10.1093/nar/gkv1189.</w:t>
+      </w:r>
+    </w:p>
+    <w:p>
+      <w:pPr>
+        <w:spacing w:after="60" w:line="240" w:lineRule="auto"/>
+        <w:ind w:left="360" w:hanging="360"/>
+      </w:pPr>
+      <w:r>
+        <w:rPr>
+          <w:sz w:val="17"/>
+        </w:rPr>
+        <w:t>88. National Center for Biotechnology Information. The Genetic Codes. https://www.ncbi.nlm.nih.gov/Taxonomy/Utils/wprintgc.cgi (accessed 2026-09-02).</w:t>
+      </w:r>
+    </w:p>
+    <w:p>
+      <w:pPr>
+        <w:spacing w:after="60" w:line="240" w:lineRule="auto"/>
+        <w:ind w:left="360" w:hanging="360"/>
+      </w:pPr>
+      <w:r>
+        <w:rPr>
+          <w:sz w:val="17"/>
+        </w:rPr>
+        <w:t>89. Ben-Bassat, A.; Bauer, K.; Chang, S. Y.; et al. Processing of the Initiation Methionine from Proteins: Properties of the Escherichia coli Methionine Aminopeptidase and Its Gene Structure. J. Bacteriol. 1987, 169, 751–757. https://doi.org/10.1128/jb.169.2.751-757.1987.</w:t>
+      </w:r>
+    </w:p>
+    <w:p>
+      <w:pPr>
+        <w:spacing w:after="60" w:line="240" w:lineRule="auto"/>
+        <w:ind w:left="360" w:hanging="360"/>
+      </w:pPr>
+      <w:r>
+        <w:rPr>
+          <w:sz w:val="17"/>
+        </w:rPr>
+        <w:t>90. Xiao, Q.; Zhang, F.; Nacev, B. A.; Liu, J. O.; Pei, D. Protein N-Terminal Processing: Substrate Specificity of Escherichia coli and Human Methionine Aminopeptidases. Biochemistry 2010, 49, 5588–5599. https://doi.org/10.1021/bi1005464.</w:t>
       </w:r>
     </w:p>
     <w:sectPr>

</xml_diff>

<commit_message>
Complete glargine workflow and publication release gate
</commit_message>
<xml_diff>
--- a/publication/G-Synth_Final_Master_Manuscript.docx
+++ b/publication/G-Synth_Final_Master_Manuscript.docx
@@ -28,7 +28,7 @@
           <w:color w:val="39757D"/>
           <w:sz w:val="24"/>
         </w:rPr>
-        <w:t>Software implementation and experimental validation with PCR-free insulin glargine A/B-chain constructs</w:t>
+        <w:t>Software development and protein-to-sequence validation with PCR-free insulin glargine A/B-chain constructs</w:t>
       </w:r>
     </w:p>
     <w:p>
@@ -87,7 +87,7 @@
     </w:p>
     <w:p>
       <w:r>
-        <w:t>Nucleic-acid design for synthesis is often fragmented across codon tools, restriction maps, plasmid editors and sequencing viewers, complicating proof that an ordered molecule is the one later cloned and assessed. We developed G-Synth, an open-source application and Python engine implementing 15 source-traceable host codon profiles and two synthesis-centred workflows: Small Sequence Design (SSD) for one complementary oligonucleotide pair and Extended Sequence Design (ESD) for tiled, directional pairs. Both derive strand-specific restriction products and block release unless in-silico annealing and ordered ligation reconstruct both intended strands exactly. A staged Design→Hybridization→Restriction-cloning workflow exposes unpaired bases as cohesive ends in compact and nucleotide-level double-strand views, verifies complementarity with a digested vector and requires explicit ligation before product analysis. The same record supports peptide back-translation with explicit initiator handling, editable annotation, PCR/digest/gel simulation and quality-aware Sanger validation. The separated engine, API and interface passed 1,113, 265 and 91 tests, respectively. In an experimentally grounded case study, SSD regenerated insulin glargine A- and B-chain constructs; all four oligonucleotides exactly matched archived synthesis records. NdeI/XhoI cloning into pET-21a(+) preserved the intended open reading frames and generated 5,490-bp and 5,523-bp recombinant plasmids. G-Synth assembled the four author-designated chromatograms into 100%-covered, 100%-identical consensus sequences. Bidirectional overlap was 56.1% for A and 71.2% for B, with 100% F/R agreement; independent Biopython analysis reproduced complete coverage and identity. The exact SSD/ESD release-gate combination was not identified in prior design-automation literature and is, to our knowledge, first automated and disclosed here. Protein expression, folding and bioactivity were not tested.</w:t>
+        <w:t>Nucleic-acid design for synthesis is often fragmented across codon tools, restriction maps, plasmid editors and sequencing viewers, complicating proof that an ordered molecule is the one later cloned and assessed. We developed G-Synth, an open-source application and dependency-free Python engine implementing 15 source-traceable host codon profiles and two synthesis-centred workflows: Small Sequence Design (SSD) for one complementary oligonucleotide pair and Extended Sequence Design (ESD) for tiled, directional pairs. Both derive strand-specific restriction products and block release unless in-silico annealing and ordered ligation reconstruct both intended strands exactly. The implementation separates the tested molecular engine, a Django REST service and a React/TypeScript interface. We first exercised the current workflow from the mature insulin glargine A- and B-chain amino-acid sequences. G-Synth preserved both non-methionine N termini, reverse-translated them with the selected Escherichia coli profile, applied synthesis and NdeI/XhoI constraints, generated SSD order molecules, verified their duplexes and produced clonable 5,490-bp and 5,523-bp pET-21a(+) models. These new synonymous DNA designs were validated computationally. In a separate retrospective experimental track, SSD regenerated the constructs synthesized at the bench; all four oligonucleotides matched their order records exactly. G-Synth then assembled the four author-designated chromatograms into 100%-covered, 100%-identical consensus sequences. Bidirectional overlap was 56.1% for A and 71.2% for B, with 100% F/R agreement; independent Biopython analysis reproduced complete coverage and identity. The engine, API and interface passed 1,113, 265 and 92 tests, respectively. The exact SSD/ESD release-gate combination was not identified in prior design-automation literature and is, to our knowledge, first automated and disclosed here. Protein expression, folding and bioactivity were not tested.</w:t>
       </w:r>
     </w:p>
     <w:p>
@@ -105,7 +105,7 @@
         <w:drawing>
           <wp:inline xmlns:a="http://schemas.openxmlformats.org/drawingml/2006/main" xmlns:pic="http://schemas.openxmlformats.org/drawingml/2006/picture">
             <wp:extent cx="6035040" cy="3369143"/>
-            <wp:docPr id="1" name="Picture 1" title="Figure_1_GSynth_workflow_and_architecture" descr="Figure 1. G-Synth workflow and software architecture. The design, build, clone and verify stages share a deterministic Python engine. The API stores project provenance and the web workspace renders the engine outputs without reimplementing biological calculations."/>
+            <wp:docPr id="1" name="Picture 1" title="Figure_1_GSynth_workflow_and_architecture" descr="G-Synth workflow and software architecture. The design, build, clone and verify stages share a deterministic Python engine. The API stores project provenance and the web workspace renders the engine outputs without reimplementing biological calculations."/>
             <wp:cNvGraphicFramePr>
               <a:graphicFrameLocks noChangeAspect="1"/>
             </wp:cNvGraphicFramePr>
@@ -146,6 +146,19 @@
     </w:p>
     <w:p>
       <w:pPr>
+        <w:pStyle w:val="Caption"/>
+        <w:spacing w:before="0" w:after="160"/>
+      </w:pPr>
+      <w:r>
+        <w:rPr>
+          <w:i/>
+          <w:color w:val="5D6B78"/>
+        </w:rPr>
+        <w:t>Alt text: G-Synth workflow and software architecture. The design, build, clone and verify stages share a deterministic Python engine. The API stores project provenance and the web workspace renders the engine outputs without reimplementing biological calculations.</w:t>
+      </w:r>
+    </w:p>
+    <w:p>
+      <w:pPr>
         <w:pStyle w:val="Heading1"/>
       </w:pPr>
       <w:r>
@@ -164,7 +177,7 @@
     </w:p>
     <w:p>
       <w:r>
-        <w:t>Insulin glargine A- and B-chain constructs offered a stringent retrospective case study because their long complementary oligonucleotides had been independently synthesized, hybridized, cloned into pET-21a(+), transformed into Escherichia coli DH5α and sequenced. The original draft used Benchling for reverse-complement operations and Geneious Prime for visual cloning and alignment. Here, those inputs and primary trace files were reanalysed with G-Synth as the primary system. The objectives were to (i) reproduce the exact archived orderable molecules from the optimized chain sequences; (ii) validate terminal-end geometry, junctions, open reading frames and plasmid context; (iii) assemble the physical F/R trace evidence and distinguish complete consensus coverage from bidirectional overlap; and (iv) compare G-Synth's focused, auditable workflow with established software categories.</w:t>
+        <w:t>Insulin glargine A- and B-chain constructs offered both a current end-to-end demonstration and a stringent retrospective case study. The analysis therefore used two explicitly separated tracks. First, G-Synth began from the mature amino-acid sequences, performed E. coli-conditioned reverse translation and carried the resulting synonymous DNA through SSD, hybridization and restriction cloning. Second, the nucleotide inputs and four molecules synthesized, hybridized, cloned into pET-21a(+), transformed into Escherichia coli DH5α and sequenced in the source study were reanalysed without substitution. Benchling had supplied reverse-complement operations and Geneious Prime the visual cloning and alignment checks in that study; G-Synth is the primary system in the present analysis. The objectives were to (i) demonstrate the complete current protein-to-clone workflow; (ii) reproduce the exact experimental order molecules; (iii) validate terminal-end geometry, junctions, open reading frames and plasmid context; (iv) assemble the physical F/R trace evidence while distinguishing consensus coverage from bidirectional overlap; and (v) compare G-Synth's focused, auditable workflow with established software categories.</w:t>
       </w:r>
     </w:p>
     <w:p>
@@ -172,7 +185,7 @@
         <w:pStyle w:val="Heading1"/>
       </w:pPr>
       <w:r>
-        <w:t>2. Results: software design and implementation</w:t>
+        <w:t>2. Software development, implementation and scientific logic</w:t>
       </w:r>
     </w:p>
     <w:p>
@@ -180,12 +193,12 @@
         <w:pStyle w:val="Heading2"/>
       </w:pPr>
       <w:r>
-        <w:t>2.1 Separation of scientific logic, service layer and interface</w:t>
+        <w:t>2.1 Architecture and development tools</w:t>
       </w:r>
     </w:p>
     <w:p>
       <w:r>
-        <w:t>G-Synth comprises three layers (Figure 1). The gsynth_engine Python package contains sequence normalization, codon optimization, nearest-neighbour thermodynamics, enzyme definitions, duplex construction, multi-oligonucleotide assembly, PCR, cloning, ligation, annotation, gel simulation and read verification. It has no web-framework dependency. A Django REST API validates requests, applies access control and serializes immutable calculation outputs together with project provenance. A React/TypeScript workspace renders the outputs, supports editable annotations and guides the user through Design, PCR, Clone, Check, Compare and Learn. This separation makes the engine importable in scripts and permits molecular regression tests to execute without a database or browser.</w:t>
+        <w:t>G-Synth was implemented as three deliberately separated layers (Figure 1). The gsynth_engine package is a dependency-free Python 3.11+ scientific core containing sequence normalization, codon optimization, nearest-neighbour thermodynamics, enzyme definitions, duplex construction, multi-oligonucleotide assembly, PCR, cloning, ligation, annotation, gel simulation and read verification. A Django 5.2/Django REST Framework service validates JSON requests, applies JWT-based account isolation and serializes immutable calculation outputs with project provenance; SQLite supports local development and PostgreSQL is required for production deployment. A React 18 and TypeScript 5 single-page workspace, compiled with Vite, renders engine outputs and uses SeqViz for sequence maps without reimplementing molecular calculations. Production serving uses Gunicorn and WhiteNoise. Pytest, property and golden-reference tests validate the engine and API; Vitest, Testing Library, TypeScript compilation and production builds validate the interface; Ruff enforces Python static quality. Biopython is used only for independent file-format and alignment cross-checks, not as a hidden runtime dependency of the engine [66]. This architecture follows robustness, workflow-readiness and research-software traceability recommendations [72–74].</w:t>
       </w:r>
     </w:p>
     <w:p>
@@ -257,7 +270,7 @@
         <w:drawing>
           <wp:inline xmlns:a="http://schemas.openxmlformats.org/drawingml/2006/main" xmlns:pic="http://schemas.openxmlformats.org/drawingml/2006/picture">
             <wp:extent cx="6035040" cy="5683354"/>
-            <wp:docPr id="2" name="Picture 2" title="Hybridization_Workflow" descr="Figure 2. G-Synth hybridization view after direct transfer from SSD. Both order molecules remain entered 5′→3′; the lower strand is drawn antiparallel. The 123-bp core is completely paired, while the NdeI-derived 5′-TA and XhoI-derived 5′-TCGA products remain visibly unpaired as cohesive ends."/>
+            <wp:docPr id="2" name="Picture 2" title="Hybridization_Workflow" descr="G-Synth hybridization view after direct transfer from SSD. Both order molecules remain entered 5′→3′; the lower strand is drawn antiparallel. The 123-bp core is completely paired, while the NdeI-derived 5′-TA and XhoI-derived 5′-TCGA products remain visibly unpaired as cohesive ends."/>
             <wp:cNvGraphicFramePr>
               <a:graphicFrameLocks noChangeAspect="1"/>
             </wp:cNvGraphicFramePr>
@@ -265,7 +278,7 @@
               <a:graphicData uri="http://schemas.openxmlformats.org/drawingml/2006/picture">
                 <pic:pic>
                   <pic:nvPicPr>
-                    <pic:cNvPr id="0" name="Hybridization_Workflow.png"/>
+                    <pic:cNvPr id="0" name="Hybridization_Workflow.jpg"/>
                     <pic:cNvPicPr/>
                   </pic:nvPicPr>
                   <pic:blipFill>
@@ -298,6 +311,19 @@
     </w:p>
     <w:p>
       <w:pPr>
+        <w:pStyle w:val="Caption"/>
+        <w:spacing w:before="0" w:after="160"/>
+      </w:pPr>
+      <w:r>
+        <w:rPr>
+          <w:i/>
+          <w:color w:val="5D6B78"/>
+        </w:rPr>
+        <w:t>Alt text: G-Synth hybridization view after direct transfer from SSD. Both order molecules remain entered 5′→3′; the lower strand is drawn antiparallel. The 123-bp core is completely paired, while the NdeI-derived 5′-TA and XhoI-derived 5′-TCGA products remain visibly unpaired as cohesive ends.</w:t>
+      </w:r>
+    </w:p>
+    <w:p>
+      <w:pPr>
         <w:pStyle w:val="Heading2"/>
       </w:pPr>
       <w:r>
@@ -306,7 +332,7 @@
     </w:p>
     <w:p>
       <w:r>
-        <w:t>The cloning module imports FASTA, GenBank and SnapGene DNA files and includes verified pET-21a(+) and pET-21(+) sequences. It checks vector identity, requires each selected enzyme to cut once and presents the workflow as Vector + duplex Insert → Product. Before ligation, six compatibility checks report strand pairing, unique vector cuts, orientation, site regeneration and reading-frame consequences. Simple and detailed junction views place each exposed insert end beside the complementary vector end. The product map, diagnostic gel and exports remain hidden until the user explicitly selects Ligate compatible ends; this button simulates joining the phosphodiester backbone and is not represented as an experimental ligation. The coordinate-level annotated view handles circular-origin crossings, strand direction and codon-aligned translation. Curated exact matches to common promoters, operators, tags, linkers and cleavage motifs are suggestions, not silently accepted claims; users can create, name, move or delete features and preserve edits in GenBank export.</w:t>
+        <w:t>The cloning module imports FASTA, GenBank and SnapGene DNA files and includes verified pET-21a(+) and pET-21(+) sequences. It checks vector identity, requires each selected enzyme to cut once and presents the workflow as Vector + duplex Insert → Product. Before ligation, six compatibility checks report strand pairing, unique vector cuts, orientation, site regeneration and reading-frame consequences. Simple and detailed junction views place each exposed insert end beside the complementary vector end; the joined sequence is explicitly labelled as an expected product until the action is performed. The product map, diagnostic gel and exports remain hidden until the user selects Ligate compatible ends. Only then does an accessible green confirmation panel display the verified recombinant length, the Vector + Insert → Product relationship and close-up nucleotide sequences for both closed junctions. This state transition simulates joining the phosphodiester backbone and is not represented as an experimental ligation. The coordinate-level annotated view handles circular-origin crossings, strand direction and codon-aligned translation. Curated exact matches to common promoters, operators, tags, linkers and cleavage motifs are suggestions, not silently accepted claims; users can create, name, move or delete features and preserve edits in GenBank export.</w:t>
       </w:r>
     </w:p>
     <w:p>
@@ -323,8 +349,8 @@
       <w:r>
         <w:drawing>
           <wp:inline xmlns:a="http://schemas.openxmlformats.org/drawingml/2006/main" xmlns:pic="http://schemas.openxmlformats.org/drawingml/2006/picture">
-            <wp:extent cx="6035040" cy="3394934"/>
-            <wp:docPr id="3" name="Picture 3" title="Cloning_PreLigation" descr="Figure 3A. Pre-ligation compatibility gate. G-Synth shows the NdeI and XhoI vector–insert junctions, their opposite polarities and all six passed checks while withholding recombinant-product analyses."/>
+            <wp:extent cx="4922520" cy="3718560"/>
+            <wp:docPr id="3" name="Picture 3" title="Cloning_PreLigation" descr="Pre-ligation compatibility gate for the current glargine A design. G-Synth shows the 125-bp insert, the NdeI and XhoI vector–insert junctions, their opposite polarities and all six passed checks while labelling the joined sequence as expected and withholding recombinant-product analyses."/>
             <wp:cNvGraphicFramePr>
               <a:graphicFrameLocks noChangeAspect="1"/>
             </wp:cNvGraphicFramePr>
@@ -344,7 +370,7 @@
                   <pic:spPr>
                     <a:xfrm>
                       <a:off x="0" y="0"/>
-                      <a:ext cx="6035040" cy="3394934"/>
+                      <a:ext cx="4922520" cy="3718560"/>
                     </a:xfrm>
                     <a:prstGeom prst="rect"/>
                   </pic:spPr>
@@ -360,11 +386,24 @@
         <w:pStyle w:val="Caption"/>
       </w:pPr>
       <w:r>
-        <w:t>Figure 3A. Pre-ligation compatibility gate. G-Synth shows the NdeI and XhoI vector–insert junctions, their opposite polarities and all six passed checks while withholding recombinant-product analyses.</w:t>
+        <w:t>Figure 3A. Pre-ligation compatibility gate for the current glargine A design. G-Synth shows the 125-bp insert, the NdeI and XhoI vector–insert junctions, their opposite polarities and all six passed checks while labelling the joined sequence as expected and withholding recombinant-product analyses.</w:t>
       </w:r>
     </w:p>
     <w:p>
       <w:pPr>
+        <w:pStyle w:val="Caption"/>
+        <w:spacing w:before="0" w:after="160"/>
+      </w:pPr>
+      <w:r>
+        <w:rPr>
+          <w:i/>
+          <w:color w:val="5D6B78"/>
+        </w:rPr>
+        <w:t>Alt text: Pre-ligation compatibility gate for the current glargine A design. G-Synth shows the 125-bp insert, the NdeI and XhoI vector–insert junctions, their opposite polarities and all six passed checks while labelling the joined sequence as expected and withholding recombinant-product analyses.</w:t>
+      </w:r>
+    </w:p>
+    <w:p>
+      <w:pPr>
         <w:keepNext/>
         <w:spacing w:before="80" w:after="40"/>
         <w:jc w:val="center"/>
@@ -372,8 +411,8 @@
       <w:r>
         <w:drawing>
           <wp:inline xmlns:a="http://schemas.openxmlformats.org/drawingml/2006/main" xmlns:pic="http://schemas.openxmlformats.org/drawingml/2006/picture">
-            <wp:extent cx="6035040" cy="3394934"/>
-            <wp:docPr id="4" name="Picture 4" title="Cloning_Ligated_Product" descr="Figure 3B. Post-ligation state for the glargine A-chain construct. The 5,490-bp product is created only after explicit in-silico ligation, after which the plasmid map, diagnostic digest, gel and exports become available."/>
+            <wp:extent cx="4922520" cy="3718560"/>
+            <wp:docPr id="4" name="Picture 4" title="Cloning_Ligated_Product" descr="Post-ligation state for the current glargine A-chain construct. A green confirmation panel reports the 5,490-bp recombinant product and shows both closed nucleotide junctions only after explicit in-silico ligation; the plasmid map, diagnostic digest, gel and exports then become available."/>
             <wp:cNvGraphicFramePr>
               <a:graphicFrameLocks noChangeAspect="1"/>
             </wp:cNvGraphicFramePr>
@@ -393,7 +432,7 @@
                   <pic:spPr>
                     <a:xfrm>
                       <a:off x="0" y="0"/>
-                      <a:ext cx="6035040" cy="3394934"/>
+                      <a:ext cx="4922520" cy="3718560"/>
                     </a:xfrm>
                     <a:prstGeom prst="rect"/>
                   </pic:spPr>
@@ -409,7 +448,20 @@
         <w:pStyle w:val="Caption"/>
       </w:pPr>
       <w:r>
-        <w:t>Figure 3B. Post-ligation state for the glargine A-chain construct. The 5,490-bp product is created only after explicit in-silico ligation, after which the plasmid map, diagnostic digest, gel and exports become available.</w:t>
+        <w:t>Figure 3B. Post-ligation state for the current glargine A-chain construct. A green confirmation panel reports the 5,490-bp recombinant product and shows both closed nucleotide junctions only after explicit in-silico ligation; the plasmid map, diagnostic digest, gel and exports then become available.</w:t>
+      </w:r>
+    </w:p>
+    <w:p>
+      <w:pPr>
+        <w:pStyle w:val="Caption"/>
+        <w:spacing w:before="0" w:after="160"/>
+      </w:pPr>
+      <w:r>
+        <w:rPr>
+          <w:i/>
+          <w:color w:val="5D6B78"/>
+        </w:rPr>
+        <w:t>Alt text: Post-ligation state for the current glargine A-chain construct. A green confirmation panel reports the 5,490-bp recombinant product and shows both closed nucleotide junctions only after explicit in-silico ligation; the plasmid map, diagnostic digest, gel and exports then become available.</w:t>
       </w:r>
     </w:p>
     <w:p>
@@ -448,12 +500,382 @@
         <w:pStyle w:val="Heading1"/>
       </w:pPr>
       <w:r>
-        <w:t>3. Validation results</w:t>
+        <w:t>3. End-to-end G-Synth workflow from insulin glargine protein sequences</w:t>
+      </w:r>
+    </w:p>
+    <w:p>
+      <w:pPr>
+        <w:pStyle w:val="Heading2"/>
+      </w:pPr>
+      <w:r>
+        <w:t>3.1 Protein input, biological role and host-conditioned reverse translation</w:t>
       </w:r>
     </w:p>
     <w:p>
       <w:r>
-        <w:t>Validation combined unit, property, API and interface tests with a retrospective experimental case study. The engine suite contains golden examples, error-path tests, host-profile invariants, peptide-start decisions, enzyme-wide properties and antiparallel-hybridization cases covering 5′/3′ overhangs, blunt ends, ambiguity, mismatches and thermodynamic reporting boundaries. The defining assembly property is equality between the intended construct and both strands reconstructed from the exported oligonucleotides. API tests cover request validation, host selection, peptide-to-DNA serialization, authentication, projects, sequence import, hybridization, PCR and security. Interface tests cover the design and validation views, host-profile and peptide-role selection, automatic Design-to-Hybridization-to-Restriction-cloning handoff, simultaneous compact and nucleotide-level duplex evidence, editable annotations, primer-tail hybridization, gels, Learn content and responsive behaviour. The complete suites were executed from the manuscript working tree on 2 September 2026: 1,113/1,113 engine, 265/265 API and 91/91 interface tests passed.</w:t>
+        <w:t>The current G-Synth workflow began with the amino-acid sequences of the mature insulin glargine chains: GIVEQCCTSICSLYQLENYCG for A and FVNQHLCGSHLVEALYLVCGERGFFYTPKTRR for B. Neither input begins with methionine because each represents a mature chain or precursor-derived chain segment rather than a complete standalone translation product. Automatic peptide-role inference therefore resolved both as mature peptide/fusion inserts, preserved every supplied residue and did not introduce an artificial N-terminal methionine. This decision remained user-overridable and was recorded in the output provenance.</w:t>
+      </w:r>
+    </w:p>
+    <w:p>
+      <w:r>
+        <w:t>Escherichia coli was selected as the intended expression host. G-Synth reverse-translated each peptide with the committed September 2021 HIVE-CUTs/CoCoPUTs species profile while excluding internal NdeI and XhoI sites, low-frequency profile codons, homopolymers longer than five bases, repeats of 15 nt or longer and 50-nt windows outside 40–60% GC. A TAA stop codon was retained. Translation of each candidate was then compared with the supplied peptide plus termination as a blocking invariant. Both sequences passed without warnings: A was 66 bp, with profile-relative CAI 1.000 and 50.0% GC; B was 99 bp, with profile-relative CAI 0.944 and 53.5% GC. These values describe fit to the selected species-wide codon profile and are not predictions of expression yield.</w:t>
+      </w:r>
+    </w:p>
+    <w:tbl>
+      <w:tblPr>
+        <w:tblW w:type="auto" w:w="0"/>
+        <w:jc w:val="center"/>
+        <w:tblLayout w:type="fixed"/>
+        <w:tblLook w:firstColumn="1" w:firstRow="1" w:lastColumn="0" w:lastRow="0" w:noHBand="0" w:noVBand="1" w:val="04A0"/>
+        <w:tblBorders>
+          <w:top w:val="single" w:sz="6" w:color="C8D0D8"/>
+          <w:left w:val="single" w:sz="6" w:color="C8D0D8"/>
+          <w:bottom w:val="single" w:sz="6" w:color="C8D0D8"/>
+          <w:right w:val="single" w:sz="6" w:color="C8D0D8"/>
+          <w:insideH w:val="single" w:sz="6" w:color="C8D0D8"/>
+          <w:insideV w:val="single" w:sz="6" w:color="C8D0D8"/>
+        </w:tblBorders>
+      </w:tblPr>
+      <w:tblGrid>
+        <w:gridCol w:w="2412"/>
+        <w:gridCol w:w="2412"/>
+        <w:gridCol w:w="2412"/>
+        <w:gridCol w:w="2412"/>
+      </w:tblGrid>
+      <w:tr>
+        <w:trPr>
+          <w:tblHeader w:val="true"/>
+        </w:trPr>
+        <w:tc>
+          <w:tcPr>
+            <w:tcW w:type="dxa" w:w="605"/>
+            <w:tcMar>
+              <w:top w:w="80" w:type="dxa"/>
+              <w:start w:w="120" w:type="dxa"/>
+              <w:bottom w:w="80" w:type="dxa"/>
+              <w:end w:w="120" w:type="dxa"/>
+            </w:tcMar>
+            <w:shd w:fill="12233F"/>
+            <w:vAlign w:val="center"/>
+          </w:tcPr>
+          <w:p>
+            <w:pPr>
+              <w:spacing w:after="0"/>
+            </w:pPr>
+            <w:r>
+              <w:rPr>
+                <w:b/>
+                <w:color w:val="FFFFFF"/>
+                <w:sz w:val="13"/>
+              </w:rPr>
+              <w:t>Chain</w:t>
+            </w:r>
+          </w:p>
+        </w:tc>
+        <w:tc>
+          <w:tcPr>
+            <w:tcW w:type="dxa" w:w="1944"/>
+            <w:tcMar>
+              <w:top w:w="80" w:type="dxa"/>
+              <w:start w:w="120" w:type="dxa"/>
+              <w:bottom w:w="80" w:type="dxa"/>
+              <w:end w:w="120" w:type="dxa"/>
+            </w:tcMar>
+            <w:shd w:fill="12233F"/>
+            <w:vAlign w:val="center"/>
+          </w:tcPr>
+          <w:p>
+            <w:pPr>
+              <w:spacing w:after="0"/>
+            </w:pPr>
+            <w:r>
+              <w:rPr>
+                <w:b/>
+                <w:color w:val="FFFFFF"/>
+                <w:sz w:val="13"/>
+              </w:rPr>
+              <w:t>Protein input</w:t>
+            </w:r>
+          </w:p>
+        </w:tc>
+        <w:tc>
+          <w:tcPr>
+            <w:tcW w:type="dxa" w:w="5256"/>
+            <w:tcMar>
+              <w:top w:w="80" w:type="dxa"/>
+              <w:start w:w="120" w:type="dxa"/>
+              <w:bottom w:w="80" w:type="dxa"/>
+              <w:end w:w="120" w:type="dxa"/>
+            </w:tcMar>
+            <w:shd w:fill="12233F"/>
+            <w:vAlign w:val="center"/>
+          </w:tcPr>
+          <w:p>
+            <w:pPr>
+              <w:spacing w:after="0"/>
+            </w:pPr>
+            <w:r>
+              <w:rPr>
+                <w:b/>
+                <w:color w:val="FFFFFF"/>
+                <w:sz w:val="13"/>
+              </w:rPr>
+              <w:t>G-Synth E. coli-conditioned DNA (5′→3′)</w:t>
+            </w:r>
+          </w:p>
+        </w:tc>
+        <w:tc>
+          <w:tcPr>
+            <w:tcW w:type="dxa" w:w="1699"/>
+            <w:tcMar>
+              <w:top w:w="80" w:type="dxa"/>
+              <w:start w:w="120" w:type="dxa"/>
+              <w:bottom w:w="80" w:type="dxa"/>
+              <w:end w:w="120" w:type="dxa"/>
+            </w:tcMar>
+            <w:shd w:fill="12233F"/>
+            <w:vAlign w:val="center"/>
+          </w:tcPr>
+          <w:p>
+            <w:pPr>
+              <w:spacing w:after="0"/>
+            </w:pPr>
+            <w:r>
+              <w:rPr>
+                <w:b/>
+                <w:color w:val="FFFFFF"/>
+                <w:sz w:val="13"/>
+              </w:rPr>
+              <w:t>Profile fit</w:t>
+            </w:r>
+          </w:p>
+        </w:tc>
+      </w:tr>
+      <w:tr>
+        <w:trPr>
+          <w:cantSplit/>
+        </w:trPr>
+        <w:tc>
+          <w:tcPr>
+            <w:tcW w:type="dxa" w:w="605"/>
+            <w:tcMar>
+              <w:top w:w="80" w:type="dxa"/>
+              <w:start w:w="120" w:type="dxa"/>
+              <w:bottom w:w="80" w:type="dxa"/>
+              <w:end w:w="120" w:type="dxa"/>
+            </w:tcMar>
+          </w:tcPr>
+          <w:p>
+            <w:pPr>
+              <w:spacing w:after="0" w:line="240" w:lineRule="auto"/>
+            </w:pPr>
+            <w:r>
+              <w:rPr>
+                <w:sz w:val="13"/>
+              </w:rPr>
+              <w:t>A</w:t>
+            </w:r>
+          </w:p>
+        </w:tc>
+        <w:tc>
+          <w:tcPr>
+            <w:tcW w:type="dxa" w:w="1944"/>
+            <w:tcMar>
+              <w:top w:w="80" w:type="dxa"/>
+              <w:start w:w="120" w:type="dxa"/>
+              <w:bottom w:w="80" w:type="dxa"/>
+              <w:end w:w="120" w:type="dxa"/>
+            </w:tcMar>
+          </w:tcPr>
+          <w:p>
+            <w:pPr>
+              <w:spacing w:after="0" w:line="240" w:lineRule="auto"/>
+            </w:pPr>
+            <w:r>
+              <w:rPr>
+                <w:sz w:val="13"/>
+              </w:rPr>
+              <w:t>GIVEQCCTSICSLYQLENYCG</w:t>
+            </w:r>
+          </w:p>
+        </w:tc>
+        <w:tc>
+          <w:tcPr>
+            <w:tcW w:type="dxa" w:w="5256"/>
+            <w:tcMar>
+              <w:top w:w="80" w:type="dxa"/>
+              <w:start w:w="120" w:type="dxa"/>
+              <w:bottom w:w="80" w:type="dxa"/>
+              <w:end w:w="120" w:type="dxa"/>
+            </w:tcMar>
+          </w:tcPr>
+          <w:p>
+            <w:pPr>
+              <w:spacing w:after="0" w:line="240" w:lineRule="auto"/>
+            </w:pPr>
+            <w:r>
+              <w:rPr>
+                <w:sz w:val="13"/>
+              </w:rPr>
+              <w:t>GGCATTGTGGAACAGTGCTGCACCAGCATTTGCAGCCTGTATCAGCTGGAAAACTATTGCGGCTAA</w:t>
+            </w:r>
+          </w:p>
+        </w:tc>
+        <w:tc>
+          <w:tcPr>
+            <w:tcW w:type="dxa" w:w="1699"/>
+            <w:tcMar>
+              <w:top w:w="80" w:type="dxa"/>
+              <w:start w:w="120" w:type="dxa"/>
+              <w:bottom w:w="80" w:type="dxa"/>
+              <w:end w:w="120" w:type="dxa"/>
+            </w:tcMar>
+          </w:tcPr>
+          <w:p>
+            <w:pPr>
+              <w:spacing w:after="0" w:line="240" w:lineRule="auto"/>
+            </w:pPr>
+            <w:r>
+              <w:rPr>
+                <w:sz w:val="13"/>
+              </w:rPr>
+              <w:t>CAI 1.000; GC 50.0%</w:t>
+            </w:r>
+          </w:p>
+        </w:tc>
+      </w:tr>
+      <w:tr>
+        <w:trPr>
+          <w:cantSplit/>
+        </w:trPr>
+        <w:tc>
+          <w:tcPr>
+            <w:tcW w:type="dxa" w:w="605"/>
+            <w:tcMar>
+              <w:top w:w="80" w:type="dxa"/>
+              <w:start w:w="120" w:type="dxa"/>
+              <w:bottom w:w="80" w:type="dxa"/>
+              <w:end w:w="120" w:type="dxa"/>
+            </w:tcMar>
+            <w:shd w:fill="F2F4F7"/>
+          </w:tcPr>
+          <w:p>
+            <w:pPr>
+              <w:spacing w:after="0" w:line="240" w:lineRule="auto"/>
+            </w:pPr>
+            <w:r>
+              <w:rPr>
+                <w:sz w:val="13"/>
+              </w:rPr>
+              <w:t>B</w:t>
+            </w:r>
+          </w:p>
+        </w:tc>
+        <w:tc>
+          <w:tcPr>
+            <w:tcW w:type="dxa" w:w="1944"/>
+            <w:tcMar>
+              <w:top w:w="80" w:type="dxa"/>
+              <w:start w:w="120" w:type="dxa"/>
+              <w:bottom w:w="80" w:type="dxa"/>
+              <w:end w:w="120" w:type="dxa"/>
+            </w:tcMar>
+            <w:shd w:fill="F2F4F7"/>
+          </w:tcPr>
+          <w:p>
+            <w:pPr>
+              <w:spacing w:after="0" w:line="240" w:lineRule="auto"/>
+            </w:pPr>
+            <w:r>
+              <w:rPr>
+                <w:sz w:val="13"/>
+              </w:rPr>
+              <w:t>FVNQHLCGSHLVEALYLVCGERGFFYTPKTRR</w:t>
+            </w:r>
+          </w:p>
+        </w:tc>
+        <w:tc>
+          <w:tcPr>
+            <w:tcW w:type="dxa" w:w="5256"/>
+            <w:tcMar>
+              <w:top w:w="80" w:type="dxa"/>
+              <w:start w:w="120" w:type="dxa"/>
+              <w:bottom w:w="80" w:type="dxa"/>
+              <w:end w:w="120" w:type="dxa"/>
+            </w:tcMar>
+            <w:shd w:fill="F2F4F7"/>
+          </w:tcPr>
+          <w:p>
+            <w:pPr>
+              <w:spacing w:after="0" w:line="240" w:lineRule="auto"/>
+            </w:pPr>
+            <w:r>
+              <w:rPr>
+                <w:sz w:val="13"/>
+              </w:rPr>
+              <w:t>TTTGTGAACCAGCATCTGTGTGGCAGCCATTTAGTGGAAGCGCTGTATCTGGTGTGCGGCGAACGCGGCTTCTTTTATACCCCGAAAACCCGCCGCTAA</w:t>
+            </w:r>
+          </w:p>
+        </w:tc>
+        <w:tc>
+          <w:tcPr>
+            <w:tcW w:type="dxa" w:w="1699"/>
+            <w:tcMar>
+              <w:top w:w="80" w:type="dxa"/>
+              <w:start w:w="120" w:type="dxa"/>
+              <w:bottom w:w="80" w:type="dxa"/>
+              <w:end w:w="120" w:type="dxa"/>
+            </w:tcMar>
+            <w:shd w:fill="F2F4F7"/>
+          </w:tcPr>
+          <w:p>
+            <w:pPr>
+              <w:spacing w:after="0" w:line="240" w:lineRule="auto"/>
+            </w:pPr>
+            <w:r>
+              <w:rPr>
+                <w:sz w:val="13"/>
+              </w:rPr>
+              <w:t>CAI 0.944; GC 53.5%</w:t>
+            </w:r>
+          </w:p>
+        </w:tc>
+      </w:tr>
+    </w:tbl>
+    <w:p>
+      <w:pPr>
+        <w:spacing w:after="20"/>
+      </w:pPr>
+    </w:p>
+    <w:p>
+      <w:pPr>
+        <w:pStyle w:val="Heading2"/>
+      </w:pPr>
+      <w:r>
+        <w:t>3.2 SSD, duplex verification and restriction-cloning simulation</w:t>
+      </w:r>
+    </w:p>
+    <w:p>
+      <w:r>
+        <w:t>Each newly back-translated sequence was transferred directly to SSD as a non-standalone insert. G-Synth placed it after the NdeI-supplied initiator and the MGSSHHHHHHSSGLVPRGS purification/linker/thrombin cassette, then generated the strand-specific NdeI and XhoI products. The A design contained 125-nt forward and 127-nt reverse order molecules; B contained 158-nt forward and 160-nt reverse molecules. In both cases, simulated antiparallel annealing reconstructed the full duplex core exactly and left only the expected 5′-TA and 5′-TCGA cohesive ends exposed. The verified duplexes passed the vector-cut, end-compatibility, orientation, reading-frame and site-regeneration gates and produced 5,490-bp and 5,523-bp pET-21a(+) models after explicit in-silico ligation.</w:t>
+      </w:r>
+    </w:p>
+    <w:p>
+      <w:r>
+        <w:t>The G-Synth DNA sequences differ synonymously from the physically synthesized experimental constructs while encoding the same peptides. They therefore demonstrate the current protein-to-clone workflow and its computational invariants but were not the molecules tested at the bench. Experimental validation was assigned only to the preserved experimental-sequence track in Section 4. This separation prevents retrospective bench data from being presented as physical validation of newly generated codon choices. Exact new order molecules, hashes and junction records are supplied in the Supporting Information and machine-readable evidence.</w:t>
+      </w:r>
+    </w:p>
+    <w:p>
+      <w:pPr>
+        <w:pStyle w:val="Heading2"/>
+      </w:pPr>
+      <w:r>
+        <w:t>3.3 Software and molecular validation framework</w:t>
+      </w:r>
+    </w:p>
+    <w:p>
+      <w:r>
+        <w:t>Validation combined unit, property, API and interface tests with a retrospective experimental case study. The engine suite contains golden examples, error-path tests, host-profile invariants, peptide-start decisions, enzyme-wide properties and antiparallel-hybridization cases covering 5′/3′ overhangs, blunt ends, ambiguity, mismatches and thermodynamic reporting boundaries. The defining assembly property is equality between the intended construct and both strands reconstructed from the exported oligonucleotides. API tests cover request validation, host selection, peptide-to-DNA serialization, authentication, projects, sequence import, hybridization, PCR and security. Interface tests cover the design and validation views, host-profile and peptide-role selection, automatic Design-to-Hybridization-to-Restriction-cloning handoff, simultaneous compact and nucleotide-level duplex evidence, editable annotations, primer-tail hybridization, gels, Learn content, accessible ligation confirmation and responsive behaviour. The complete suites were executed from the manuscript working tree on 2 September 2026: 1,113/1,113 engine, 265/265 API and 92/92 interface tests passed.</w:t>
       </w:r>
     </w:p>
     <w:tbl>
@@ -770,7 +1192,7 @@
               <w:rPr>
                 <w:sz w:val="17"/>
               </w:rPr>
-              <w:t>91 passed</w:t>
+              <w:t>92 passed</w:t>
             </w:r>
           </w:p>
         </w:tc>
@@ -798,7 +1220,7 @@
               <w:rPr>
                 <w:sz w:val="17"/>
               </w:rPr>
-              <w:t>Insulin glargine design</w:t>
+              <w:t>De-novo glargine workflow</w:t>
             </w:r>
           </w:p>
         </w:tc>
@@ -821,7 +1243,7 @@
               <w:rPr>
                 <w:sz w:val="17"/>
               </w:rPr>
-              <w:t>Do archived A/B inputs regenerate the four molecules synthesized at the bench?</w:t>
+              <w:t>Do protein inputs preserve identity through host optimization, SSD, hybridization and cloning?</w:t>
             </w:r>
           </w:p>
         </w:tc>
@@ -835,6 +1257,77 @@
               <w:end w:w="120" w:type="dxa"/>
             </w:tcMar>
             <w:shd w:fill="F2F4F7"/>
+          </w:tcPr>
+          <w:p>
+            <w:pPr>
+              <w:spacing w:after="0" w:line="240" w:lineRule="auto"/>
+            </w:pPr>
+            <w:r>
+              <w:rPr>
+                <w:sz w:val="17"/>
+              </w:rPr>
+              <w:t>A and B passed computational gates</w:t>
+            </w:r>
+          </w:p>
+        </w:tc>
+      </w:tr>
+      <w:tr>
+        <w:trPr>
+          <w:cantSplit/>
+        </w:trPr>
+        <w:tc>
+          <w:tcPr>
+            <w:tcW w:type="dxa" w:w="1800"/>
+            <w:tcMar>
+              <w:top w:w="80" w:type="dxa"/>
+              <w:start w:w="120" w:type="dxa"/>
+              <w:bottom w:w="80" w:type="dxa"/>
+              <w:end w:w="120" w:type="dxa"/>
+            </w:tcMar>
+          </w:tcPr>
+          <w:p>
+            <w:pPr>
+              <w:spacing w:after="0" w:line="240" w:lineRule="auto"/>
+            </w:pPr>
+            <w:r>
+              <w:rPr>
+                <w:sz w:val="17"/>
+              </w:rPr>
+              <w:t>Experimental glargine design</w:t>
+            </w:r>
+          </w:p>
+        </w:tc>
+        <w:tc>
+          <w:tcPr>
+            <w:tcW w:type="dxa" w:w="5544"/>
+            <w:tcMar>
+              <w:top w:w="80" w:type="dxa"/>
+              <w:start w:w="120" w:type="dxa"/>
+              <w:bottom w:w="80" w:type="dxa"/>
+              <w:end w:w="120" w:type="dxa"/>
+            </w:tcMar>
+          </w:tcPr>
+          <w:p>
+            <w:pPr>
+              <w:spacing w:after="0" w:line="240" w:lineRule="auto"/>
+            </w:pPr>
+            <w:r>
+              <w:rPr>
+                <w:sz w:val="17"/>
+              </w:rPr>
+              <w:t>Do the recorded A/B inputs regenerate the four molecules synthesized at the bench?</w:t>
+            </w:r>
+          </w:p>
+        </w:tc>
+        <w:tc>
+          <w:tcPr>
+            <w:tcW w:type="dxa" w:w="2160"/>
+            <w:tcMar>
+              <w:top w:w="80" w:type="dxa"/>
+              <w:start w:w="120" w:type="dxa"/>
+              <w:bottom w:w="80" w:type="dxa"/>
+              <w:end w:w="120" w:type="dxa"/>
+            </w:tcMar>
           </w:tcPr>
           <w:p>
             <w:pPr>
@@ -862,6 +1355,7 @@
               <w:bottom w:w="80" w:type="dxa"/>
               <w:end w:w="120" w:type="dxa"/>
             </w:tcMar>
+            <w:shd w:fill="F2F4F7"/>
           </w:tcPr>
           <w:p>
             <w:pPr>
@@ -884,6 +1378,7 @@
               <w:bottom w:w="80" w:type="dxa"/>
               <w:end w:w="120" w:type="dxa"/>
             </w:tcMar>
+            <w:shd w:fill="F2F4F7"/>
           </w:tcPr>
           <w:p>
             <w:pPr>
@@ -906,6 +1401,7 @@
               <w:bottom w:w="80" w:type="dxa"/>
               <w:end w:w="120" w:type="dxa"/>
             </w:tcMar>
+            <w:shd w:fill="F2F4F7"/>
           </w:tcPr>
           <w:p>
             <w:pPr>
@@ -933,7 +1429,6 @@
               <w:bottom w:w="80" w:type="dxa"/>
               <w:end w:w="120" w:type="dxa"/>
             </w:tcMar>
-            <w:shd w:fill="F2F4F7"/>
           </w:tcPr>
           <w:p>
             <w:pPr>
@@ -956,7 +1451,6 @@
               <w:bottom w:w="80" w:type="dxa"/>
               <w:end w:w="120" w:type="dxa"/>
             </w:tcMar>
-            <w:shd w:fill="F2F4F7"/>
           </w:tcPr>
           <w:p>
             <w:pPr>
@@ -979,7 +1473,6 @@
               <w:bottom w:w="80" w:type="dxa"/>
               <w:end w:w="120" w:type="dxa"/>
             </w:tcMar>
-            <w:shd w:fill="F2F4F7"/>
           </w:tcPr>
           <w:p>
             <w:pPr>
@@ -1005,7 +1498,7 @@
         <w:pStyle w:val="Heading1"/>
       </w:pPr>
       <w:r>
-        <w:t>4. Insulin glargine A/B-chain case study</w:t>
+        <w:t>4. Retrospective validation with experimentally tested glargine constructs</w:t>
       </w:r>
     </w:p>
     <w:p>
@@ -1013,12 +1506,12 @@
         <w:pStyle w:val="Heading2"/>
       </w:pPr>
       <w:r>
-        <w:t>4.1 Input sequences and cassette logic</w:t>
+        <w:t>4.1 Experimental nucleotide inputs and cassette logic</w:t>
       </w:r>
     </w:p>
     <w:p>
       <w:r>
-        <w:t>The optimized A-chain coding insert was 66 bp and encoded GIVEQCCTSICSLYQLENYCG; the B-chain insert was 99 bp and encoded FVNQHLCGSHLVEALYLVCGERGFFYTPKTRR. The second sequence includes the two C-terminal arginine residues characteristic of insulin glargine's B-chain precursor context. For each construct, G-Synth placed the insert after MGSSHHHHHHSSGLVPRGS, retained TAA termination and selected NdeI at the 5′ end and XhoI at the 3′ end. NdeI's retained bases supply the initiating ATG, so adding a separate ATG would duplicate the start. The resulting products were MGSSHHHHHHSSGLVPRGSGIVEQCCTSICSLYQLENYCG and MGSSHHHHHHSSGLVPRGSFVNQHLCGSHLVEALYLVCGERGFFYTPKTRR.</w:t>
+        <w:t>For experimental traceability, G-Synth next received the exact optimized nucleotide inputs preserved in the experimental record rather than substituting the newly generated synonymous sequences from Section 3. The tested A-chain insert was 66 bp and encoded GIVEQCCTSICSLYQLENYCG; the tested B-chain insert was 99 bp and encoded FVNQHLCGSHLVEALYLVCGERGFFYTPKTRR. The second sequence includes the two C-terminal arginine residues characteristic of insulin glargine's B-chain precursor context. For each construct, G-Synth placed the insert after MGSSHHHHHHSSGLVPRGS, retained TAA termination and selected NdeI at the 5′ end and XhoI at the 3′ end. NdeI's retained bases supply the initiating ATG, so adding a separate ATG would duplicate the start. The resulting products were MGSSHHHHHHSSGLVPRGSGIVEQCCTSICSLYQLENYCG and MGSSHHHHHHSSGLVPRGSFVNQHLCGSHLVEALYLVCGERGFFYTPKTRR.</w:t>
       </w:r>
     </w:p>
     <w:p>
@@ -1030,8 +1523,8 @@
       <w:r>
         <w:drawing>
           <wp:inline xmlns:a="http://schemas.openxmlformats.org/drawingml/2006/main" xmlns:pic="http://schemas.openxmlformats.org/drawingml/2006/picture">
-            <wp:extent cx="6035040" cy="4290172"/>
-            <wp:docPr id="5" name="Picture 5" title="Design_Release_Gate" descr="Figure 4. G-Synth design view for the glargine A-chain input. The release gate reports exact two-strand reconstruction, terminal-end compatibility and the NdeI start-codon note before displaying the orderable construct."/>
+            <wp:extent cx="4343400" cy="3087624"/>
+            <wp:docPr id="5" name="Picture 5" title="Design_Release_Gate" descr="G-Synth design view for the glargine A-chain input. The release gate reports exact two-strand reconstruction, terminal-end compatibility and the NdeI start-codon note before displaying the orderable construct."/>
             <wp:cNvGraphicFramePr>
               <a:graphicFrameLocks noChangeAspect="1"/>
             </wp:cNvGraphicFramePr>
@@ -1039,7 +1532,7 @@
               <a:graphicData uri="http://schemas.openxmlformats.org/drawingml/2006/picture">
                 <pic:pic>
                   <pic:nvPicPr>
-                    <pic:cNvPr id="0" name="Design_Release_Gate.png"/>
+                    <pic:cNvPr id="0" name="Design_Release_Gate.jpg"/>
                     <pic:cNvPicPr/>
                   </pic:nvPicPr>
                   <pic:blipFill>
@@ -1051,7 +1544,7 @@
                   <pic:spPr>
                     <a:xfrm>
                       <a:off x="0" y="0"/>
-                      <a:ext cx="6035040" cy="4290172"/>
+                      <a:ext cx="4343400" cy="3087624"/>
                     </a:xfrm>
                     <a:prstGeom prst="rect"/>
                   </pic:spPr>
@@ -1068,6 +1561,19 @@
       </w:pPr>
       <w:r>
         <w:t>Figure 4. G-Synth design view for the glargine A-chain input. The release gate reports exact two-strand reconstruction, terminal-end compatibility and the NdeI start-codon note before displaying the orderable construct.</w:t>
+      </w:r>
+    </w:p>
+    <w:p>
+      <w:pPr>
+        <w:pStyle w:val="Caption"/>
+        <w:spacing w:before="0" w:after="160"/>
+      </w:pPr>
+      <w:r>
+        <w:rPr>
+          <w:i/>
+          <w:color w:val="5D6B78"/>
+        </w:rPr>
+        <w:t>Alt text: G-Synth design view for the glargine A-chain input. The release gate reports exact two-strand reconstruction, terminal-end compatibility and the NdeI start-codon note before displaying the orderable construct.</w:t>
       </w:r>
     </w:p>
     <w:tbl>
@@ -1557,7 +2063,7 @@
               <w:rPr>
                 <w:sz w:val="17"/>
               </w:rPr>
-              <w:t>Exact match to archived synthesis record</w:t>
+              <w:t>Exact match to experimental synthesis record</w:t>
             </w:r>
           </w:p>
         </w:tc>
@@ -1761,7 +2267,7 @@
     </w:p>
     <w:p>
       <w:r>
-        <w:t>The reverse oligonucleotide is two nucleotides longer than the forward molecule in each pair (127 versus 125 nt for A; 160 versus 158 nt for B). This is an expected consequence of the strand-specific cohesive-end remainders, not a discrepancy. All four generated sequences were identical to the corresponding archived order records, and the complementary cores reconstructed without mismatch.</w:t>
+        <w:t>The reverse oligonucleotide is two nucleotides longer than the forward molecule in each pair (127 versus 125 nt for A; 160 versus 158 nt for B). This is an expected consequence of the strand-specific cohesive-end remainders, not a discrepancy. All four generated sequences were identical to the corresponding experimental order records, and the complementary cores reconstructed without mismatch.</w:t>
       </w:r>
     </w:p>
     <w:p>
@@ -1786,8 +2292,8 @@
       <w:r>
         <w:drawing>
           <wp:inline xmlns:a="http://schemas.openxmlformats.org/drawingml/2006/main" xmlns:pic="http://schemas.openxmlformats.org/drawingml/2006/picture">
-            <wp:extent cx="5806440" cy="4127666"/>
-            <wp:docPr id="6" name="Picture 6" title="Annotated_Glargine_A" descr="Figure 5A. G-Synth coordinate-level view of the insulin glargine A-chain recombinant pET-21a(+) construct. Editable feature tracks, codon-aligned translation and the regenerated NdeI and XhoI junctions are shown across the circular origin."/>
+            <wp:extent cx="4343400" cy="3087624"/>
+            <wp:docPr id="6" name="Picture 6" title="Annotated_Glargine_A" descr="G-Synth coordinate-level view of the insulin glargine A-chain recombinant pET-21a(+) construct. Editable feature tracks, codon-aligned translation and the regenerated NdeI and XhoI junctions are shown across the circular origin."/>
             <wp:cNvGraphicFramePr>
               <a:graphicFrameLocks noChangeAspect="1"/>
             </wp:cNvGraphicFramePr>
@@ -1807,7 +2313,7 @@
                   <pic:spPr>
                     <a:xfrm>
                       <a:off x="0" y="0"/>
-                      <a:ext cx="5806440" cy="4127666"/>
+                      <a:ext cx="4343400" cy="3087624"/>
                     </a:xfrm>
                     <a:prstGeom prst="rect"/>
                   </pic:spPr>
@@ -1828,6 +2334,19 @@
     </w:p>
     <w:p>
       <w:pPr>
+        <w:pStyle w:val="Caption"/>
+        <w:spacing w:before="0" w:after="160"/>
+      </w:pPr>
+      <w:r>
+        <w:rPr>
+          <w:i/>
+          <w:color w:val="5D6B78"/>
+        </w:rPr>
+        <w:t>Alt text: G-Synth coordinate-level view of the insulin glargine A-chain recombinant pET-21a(+) construct. Editable feature tracks, codon-aligned translation and the regenerated NdeI and XhoI junctions are shown across the circular origin.</w:t>
+      </w:r>
+    </w:p>
+    <w:p>
+      <w:pPr>
         <w:keepNext/>
         <w:spacing w:before="80" w:after="40"/>
         <w:jc w:val="center"/>
@@ -1835,8 +2354,8 @@
       <w:r>
         <w:drawing>
           <wp:inline xmlns:a="http://schemas.openxmlformats.org/drawingml/2006/main" xmlns:pic="http://schemas.openxmlformats.org/drawingml/2006/picture">
-            <wp:extent cx="5806440" cy="4127666"/>
-            <wp:docPr id="7" name="Picture 7" title="Annotated_Glargine_B" descr="Figure 5B. G-Synth coordinate-level view of the insulin glargine B-chain recombinant pET-21a(+) construct, using the same editable annotation and strand-aware coordinate system."/>
+            <wp:extent cx="4343400" cy="3087624"/>
+            <wp:docPr id="7" name="Picture 7" title="Annotated_Glargine_B" descr="G-Synth coordinate-level view of the insulin glargine B-chain recombinant pET-21a(+) construct, using the same editable annotation and strand-aware coordinate system."/>
             <wp:cNvGraphicFramePr>
               <a:graphicFrameLocks noChangeAspect="1"/>
             </wp:cNvGraphicFramePr>
@@ -1856,7 +2375,7 @@
                   <pic:spPr>
                     <a:xfrm>
                       <a:off x="0" y="0"/>
-                      <a:ext cx="5806440" cy="4127666"/>
+                      <a:ext cx="4343400" cy="3087624"/>
                     </a:xfrm>
                     <a:prstGeom prst="rect"/>
                   </pic:spPr>
@@ -1877,6 +2396,19 @@
     </w:p>
     <w:p>
       <w:pPr>
+        <w:pStyle w:val="Caption"/>
+        <w:spacing w:before="0" w:after="160"/>
+      </w:pPr>
+      <w:r>
+        <w:rPr>
+          <w:i/>
+          <w:color w:val="5D6B78"/>
+        </w:rPr>
+        <w:t>Alt text: G-Synth coordinate-level view of the insulin glargine B-chain recombinant pET-21a(+) construct, using the same editable annotation and strand-aware coordinate system.</w:t>
+      </w:r>
+    </w:p>
+    <w:p>
+      <w:pPr>
         <w:pStyle w:val="Heading2"/>
       </w:pPr>
       <w:r>
@@ -1885,7 +2417,7 @@
     </w:p>
     <w:p>
       <w:r>
-        <w:t>The retrospective data originated from an independent wet-laboratory project at the Genomics Technology Platform of the Higher School of Biological Sciences of Oran. Forward and reverse strands were synthesized on a MerMade 4 instrument at 1 µmol scale, purified, and annealed in 2× SSC with 0.1% SDS after 5 min at 95 °C followed by gradual cooling. The source draft reports single-stranded concentrations of 1,688.51–1,709.40 ng/µL. After hybridization, ScanDrop 260/280 ratios were 1.92 for A and 1.88 for B; Bioanalyzer sizes were 129 bp and 173 bp. These apparent sizes exceed the 123-bp and 156-bp duplex references and should be interpreted within the sizing limitations of the assay rather than as base-resolved sequence evidence.</w:t>
+        <w:t>The retrospective data originated from an independent wet-laboratory project at the Genomics Technology Platform of the Higher School of Biological Sciences of Oran. Forward and reverse strands were synthesized on a MerMade 4 instrument at 1 µmol scale, purified, and annealed in 2× SSC with 0.1% SDS after 5 min at 95 °C followed by gradual cooling. The experimental record reports single-stranded concentrations of 1,688.51–1,709.40 ng/µL. After hybridization, ScanDrop 260/280 ratios were 1.92 for A and 1.88 for B; Bioanalyzer sizes were 129 bp and 173 bp. These apparent sizes exceed the 123-bp and 156-bp duplex references and should be interpreted within the sizing limitations of the assay rather than as base-resolved sequence evidence.</w:t>
       </w:r>
     </w:p>
     <w:p>
@@ -2522,7 +3054,7 @@
     </w:p>
     <w:p>
       <w:r>
-        <w:t>The assembled consensus covered 100% of both references with 100% identity and no consensus differences. A contained 56.1% bidirectional overlap and B contained 71.2%; all overlapping F/R calls agreed (100%). Thus the paired reads jointly span each complete insert reference, while the overlap is independently observed on both orientations. Independent local alignments in Biopython 1.87 reproduced 100% combined coverage and 100% identity across aligned bases. The archived Geneious Prime figures reported visually concordant alignments but were not re-executed in the scripted environment.</w:t>
+        <w:t>The assembled consensus covered 100% of both references with 100% identity and no consensus differences. A contained 56.1% bidirectional overlap and B contained 71.2%; all overlapping F/R calls agreed (100%). Thus the paired reads jointly span each complete insert reference, while the overlap is independently observed on both orientations. Independent local alignments in Biopython 1.87 reproduced 100% combined coverage and 100% identity across aligned bases. The Geneious Prime figures from the experimental study reported visually concordant alignments but were not re-executed in the scripted environment.</w:t>
       </w:r>
     </w:p>
     <w:tbl>
@@ -2596,8 +3128,8 @@
       <w:r>
         <w:drawing>
           <wp:inline xmlns:a="http://schemas.openxmlformats.org/drawingml/2006/main" xmlns:pic="http://schemas.openxmlformats.org/drawingml/2006/picture">
-            <wp:extent cx="6035040" cy="7376160"/>
-            <wp:docPr id="8" name="Picture 8" title="Figure_4_GSynth_reference_aligned_viewer" descr="Figure 6. G-Synth's interactive reference-aligned chromatogram view for representative approved A- and B-chain reads. Base calls, consensus, quality context and four-channel peaks are displayed in reference orientation."/>
+            <wp:extent cx="5486400" cy="6705600"/>
+            <wp:docPr id="8" name="Picture 8" title="Figure_4_GSynth_reference_aligned_viewer" descr="G-Synth's interactive reference-aligned chromatogram view for representative approved A- and B-chain reads. Base calls, consensus, quality context and four-channel peaks are displayed in reference orientation."/>
             <wp:cNvGraphicFramePr>
               <a:graphicFrameLocks noChangeAspect="1"/>
             </wp:cNvGraphicFramePr>
@@ -2617,7 +3149,7 @@
                   <pic:spPr>
                     <a:xfrm>
                       <a:off x="0" y="0"/>
-                      <a:ext cx="6035040" cy="7376160"/>
+                      <a:ext cx="5486400" cy="6705600"/>
                     </a:xfrm>
                     <a:prstGeom prst="rect"/>
                   </pic:spPr>
@@ -2638,6 +3170,19 @@
     </w:p>
     <w:p>
       <w:pPr>
+        <w:pStyle w:val="Caption"/>
+        <w:spacing w:before="0" w:after="160"/>
+      </w:pPr>
+      <w:r>
+        <w:rPr>
+          <w:i/>
+          <w:color w:val="5D6B78"/>
+        </w:rPr>
+        <w:t>Alt text: G-Synth's interactive reference-aligned chromatogram view for representative approved A- and B-chain reads. Base calls, consensus, quality context and four-channel peaks are displayed in reference orientation.</w:t>
+      </w:r>
+    </w:p>
+    <w:p>
+      <w:pPr>
         <w:keepNext/>
         <w:spacing w:before="80" w:after="40"/>
         <w:jc w:val="center"/>
@@ -2646,7 +3191,7 @@
         <w:drawing>
           <wp:inline xmlns:a="http://schemas.openxmlformats.org/drawingml/2006/main" xmlns:pic="http://schemas.openxmlformats.org/drawingml/2006/picture">
             <wp:extent cx="6035040" cy="4626864"/>
-            <wp:docPr id="9" name="Picture 9" title="Figure_GSynth_Sanger_Approved_Traces" descr="Figure 7. G-Synth F/R consensus validation from the four author-designated chromatograms. The oriented reads jointly cover 100% of both references with 100% consensus identity. Green shading marks bidirectional overlap (56.1% for A and 71.2% for B); every overlapping F/R call agreed."/>
+            <wp:docPr id="9" name="Picture 9" title="Figure_GSynth_Sanger_Approved_Traces" descr="G-Synth F/R consensus validation from the four author-designated chromatograms. The oriented reads jointly cover 100% of both references with 100% consensus identity. Green shading marks bidirectional overlap (56.1% for A and 71.2% for B); every overlapping F/R call agreed."/>
             <wp:cNvGraphicFramePr>
               <a:graphicFrameLocks noChangeAspect="1"/>
             </wp:cNvGraphicFramePr>
@@ -2683,6 +3228,19 @@
       </w:pPr>
       <w:r>
         <w:t>Figure 7. G-Synth F/R consensus validation from the four author-designated chromatograms. The oriented reads jointly cover 100% of both references with 100% consensus identity. Green shading marks bidirectional overlap (56.1% for A and 71.2% for B); every overlapping F/R call agreed.</w:t>
+      </w:r>
+    </w:p>
+    <w:p>
+      <w:pPr>
+        <w:pStyle w:val="Caption"/>
+        <w:spacing w:before="0" w:after="160"/>
+      </w:pPr>
+      <w:r>
+        <w:rPr>
+          <w:i/>
+          <w:color w:val="5D6B78"/>
+        </w:rPr>
+        <w:t>Alt text: G-Synth F/R consensus validation from the four author-designated chromatograms. The oriented reads jointly cover 100% of both references with 100% consensus identity. Green shading marks bidirectional overlap (56.1% for A and 71.2% for B); every overlapping F/R call agreed.</w:t>
       </w:r>
     </w:p>
     <w:p>
@@ -3244,7 +3802,7 @@
     </w:p>
     <w:p>
       <w:r>
-        <w:t>This table is a workflow-positioning comparison, not a speed or accuracy benchmark. No proprietary Geneious algorithm was reverse-engineered, and no claim is made that G-Synth has broader functionality. Instead, the archived Geneious views provide an independent qualitative check, while the numerical cross-check uses openly scriptable Biopython alignment. A future prospective benchmark should use blinded constructs, identical trimming thresholds and predefined acceptance criteria across platforms.</w:t>
+        <w:t>This table is a workflow-positioning comparison, not a speed or accuracy benchmark. No proprietary Geneious algorithm was reverse-engineered, and no claim is made that G-Synth has broader functionality. Instead, the experimental Geneious views provide an independent qualitative check, while the numerical cross-check uses openly scriptable Biopython alignment. A future prospective benchmark should use blinded constructs, identical trimming thresholds and predefined acceptance criteria across platforms.</w:t>
       </w:r>
     </w:p>
     <w:p>
@@ -3257,7 +3815,7 @@
     </w:p>
     <w:p>
       <w:r>
-        <w:t>The insulin case study demonstrates a useful distinction between design correctness, complete assembled coverage and bidirectional support. The exact match between four G-Synth-generated oligonucleotides and the archived synthesis records, together with correct duplex reconstruction and pET-21a(+) junctions, establishes that the application's design logic reproduces the intended molecular plan. G-Synth's F/R assembly yields complete consensus coverage, 100% identity and 100% agreement across the bidirectional overlaps. Positions outside those overlaps are supported by one oriented read rather than two, a distinction the software reports explicitly instead of obscuring within a single coverage value.</w:t>
+        <w:t>The insulin case study separates three evidential levels. First, the current protein-input workflow demonstrates that G-Synth can preserve the mature A- and B-chain amino-acid sequences through E. coli-conditioned reverse translation, SSD, duplex reconstruction and restriction-cloning simulation. Second, exact regeneration of the four experimental order molecules establishes retrospective agreement between G-Synth's design logic and the molecular plan that reached the bench. Third, F/R assembly yields complete consensus coverage, 100% identity and 100% agreement across the bidirectional overlaps for those tested constructs. Positions outside the overlaps are supported by one oriented read rather than two, a distinction the software reports explicitly instead of obscuring within a single coverage value. The physical data validate the experimentally synthesized sequences, not the newly generated synonymous codon choices.</w:t>
       </w:r>
     </w:p>
     <w:p>
@@ -3285,7 +3843,7 @@
     </w:p>
     <w:p>
       <w:r>
-        <w:t>G-Synth formalizes Small Sequence Design and Extended Sequence Design as auditable synthesis-order workflows and carries the same digital molecule through peptide back-translation or host-selected codon optimization, oligonucleotide ordering, exact reconstruction, explicit hybridization, staged ligation, editable annotation, virtual PCR/digest/gel experiments and quality-aware post-sequencing review. The software passed 1,469 automated tests across its engine, API and interface. In the insulin glargine case study, SSD exactly regenerated all archived A/B oligonucleotides, produced coherent NdeI/XhoI recombinant pET-21a(+) designs and assembled the approved F/R chromatograms into 100%-covered, 100%-identical consensus sequences with perfect agreement in their bidirectional overlaps. The central contribution is not generic end-to-end software, but the first disclosed automation, to our knowledge, of the specifically defined SSD/ESD two-strand release gate and its continuity into post-sequencing evidence.</w:t>
+        <w:t>G-Synth formalizes Small Sequence Design and Extended Sequence Design as auditable synthesis-order workflows and carries a digital molecule from peptide input through host-selected reverse translation, oligonucleotide ordering, exact reconstruction, explicit hybridization, staged ligation, editable annotation, virtual PCR/digest/gel experiments and quality-aware post-sequencing review. The current insulin glargine demonstration began with the mature A- and B-chain proteins and passed every computational gate through pET-21a(+) cloning. In the separate retrospective track, SSD exactly regenerated all experimentally synthesized A/B oligonucleotides and assembled the approved F/R chromatograms into 100%-covered, 100%-identical consensus sequences with perfect agreement in their bidirectional overlaps. The software passed 1,470 automated tests across its engine, API and interface. The central contribution is not generic end-to-end software, but the first disclosed automation, to our knowledge, of the specifically defined SSD/ESD two-strand release gate and its continuity into post-sequencing evidence.</w:t>
       </w:r>
     </w:p>
     <w:p>
@@ -3306,7 +3864,7 @@
     </w:p>
     <w:p>
       <w:r>
-        <w:t>The design and cloning case study was executed with tools/publication/design_glargine_case_study.py. The script records the source-manuscript SHA-256 hash, regenerates the oligonucleotides, asserts exact equality with the archived Table 3 molecules, translates the cassette, simulates pET-21a(+) cloning and writes publication_evidence/glargine_ab_design_and_cloning.json. Trace reanalysis was executed with tools/publication/validate_insulin_correct_traces.py, which admits only the four author-designated files, hashes every reference and trace, constructs oriented G-Synth F/R consensus sequences, quantifies bidirectional overlap and agreement, performs an independent Biopython 1.87 local alignment and writes a JSON evidence record plus figure. Full commands are supplied in the Supporting Information.</w:t>
+        <w:t>The current protein-to-clone workflow and peptide-start decisions were executed with tools/publication/validate_peptide_and_enzyme_logic.py. The script records both amino-acid inputs, the selected host profile, constraints, optimized coding sequences, translations, SSD molecules, duplex equality, cohesive ends, cloned-product lengths, junctions and hashes in publication_evidence/peptide_and_enzyme_validation.json. The retrospective design and cloning case study was executed with tools/publication/design_glargine_case_study.py. That script records the experimental-source-record SHA-256 hash, regenerates the oligonucleotides, asserts exact equality with the recorded synthesis molecules, translates the cassette, simulates pET-21a(+) cloning and writes publication_evidence/glargine_ab_design_and_cloning.json. Trace reanalysis used tools/publication/validate_insulin_correct_traces.py, which admits only the four author-designated files, hashes every reference and trace, constructs oriented G-Synth F/R consensus sequences, quantifies bidirectional overlap and agreement, performs an independent Biopython 1.87 local alignment and writes a JSON evidence record plus figure. Full commands are supplied in the Supporting Information.</w:t>
       </w:r>
     </w:p>
     <w:p>
@@ -3347,7 +3905,12 @@
     </w:p>
     <w:p>
       <w:r>
-        <w:t>Insulin glargine A- and B-chain amino-acid sequences were retrieved from DrugBank record DB00047 (database version 5.1.10). The primary experimental study used GenScript reverse translation and the VectorBuilder codon-optimization tool for Escherichia coli; the exact optimized nucleotide inputs were preserved unchanged. Each cassette comprised an initiating ATG, the N-terminal peptide MGSSHHHHHHSSGLVPRGS (6×His tag, linkers and thrombin-recognition segment), the optimized glargine chain and TAA. G-Synth SSD took the preserved optimized sequence as input, derived NdeI- and XhoI-compatible strand products from cut geometry, generated the order molecules, re-annealed them in silico, verified exact reconstruction on both strands, translated the reconstructed coding sequence, and simulated directional insertion into pET-21a(+). Benchling and ExPASy operations reported in the primary draft are retained as historical design provenance; the present validation was performed first in G-Synth.</w:t>
+        <w:t>Insulin glargine A- and B-chain amino-acid sequences were retrieved from DrugBank record DB00047 (database version 5.1.10). In the current workflow, the chain sequences were entered directly as peptides. Automatic mode classified both non-methionine N termini as mature peptide/fusion inserts. G-Synth used its E. coli HIVE-CUTs/CoCoPUTs profile, retained TAA termination and optimized under 40–60% local GC, five-base homopolymer, 15-nt repeat, low-frequency-codon and internal NdeI/XhoI constraints. Every resulting DNA was re-translated before SSD. Each cassette comprised the NdeI-provided initiator, MGSSHHHHHHSSGLVPRGS (6×His tag, linkers and thrombin-recognition segment), the G-Synth-optimized chain and TAA. SSD derived the NdeI- and XhoI-compatible strand products from cut geometry, generated both order molecules, re-annealed them in silico, verified exact reconstruction on both strands, translated the reconstructed coding sequence and simulated directional insertion into pET-21a(+).</w:t>
+      </w:r>
+    </w:p>
+    <w:p>
+      <w:r>
+        <w:t>The source experimental study used GenScript reverse translation and VectorBuilder codon optimization for E. coli. Those coding sequences were preserved unchanged in a second analysis track because they, rather than the new G-Synth synonymous designs, were physically synthesized. G-Synth repeated SSD, hybridization, translation and cloning on the experimental inputs and required exact equality with the recorded order molecules. Benchling and ExPASy operations are reported as experimental provenance; the present primary validation was performed with G-Synth.</w:t>
       </w:r>
     </w:p>
     <w:p>
@@ -3414,7 +3977,7 @@
     </w:p>
     <w:p>
       <w:r>
-        <w:t>Only A Forward Seq.ab1, A Reverse Seq.ab1, B Forward Seq.ab1 and B Reverse Seq.ab1 were admitted to the present analysis. Content signatures identified the files as SCF despite their extensions. G-Synth parsed calls, qualities, peak locations and four-channel traces; evaluated both orientations; transformed placed reads into reference orientation; and merged them position by position. Consensus calls were selected by supporting-read count and then cumulative quality; exact ties were emitted as N. Consensus coverage, identity, bidirectional overlap and overlap agreement were computed separately. Because the source experiment had no prespecified trace-quality acceptance threshold, no post hoc cutoff was used for the primary retrospective endpoint. Biopython PairwiseAligner supplied an independent executable numerical comparison, and the archived Geneious Prime 2024.0.7 figure using these same four approved files supplied a secondary qualitative confirmation.</w:t>
+        <w:t>Only A Forward Seq.ab1, A Reverse Seq.ab1, B Forward Seq.ab1 and B Reverse Seq.ab1 were admitted to the present analysis. Content signatures identified the files as SCF despite their extensions. G-Synth parsed calls, qualities, peak locations and four-channel traces; evaluated both orientations; transformed placed reads into reference orientation; and merged them position by position. Consensus calls were selected by supporting-read count and then cumulative quality; exact ties were emitted as N. Consensus coverage, identity, bidirectional overlap and overlap agreement were computed separately. Because the source experiment had no prespecified trace-quality acceptance threshold, no post hoc cutoff was used for the primary retrospective endpoint. Biopython PairwiseAligner supplied an independent executable numerical comparison, and the Geneious Prime 2024.0.7 figure from the same experiment supplied a secondary qualitative confirmation.</w:t>
       </w:r>
     </w:p>
     <w:p>
@@ -3427,7 +3990,7 @@
     </w:p>
     <w:p>
       <w:r>
-        <w:t>The G-Synth source code, tests and documentation are available under the MIT License at https://github.com/Midotech31/g-synth-app. A versioned archival DOI will be inserted after repository release and Zenodo deposition. Reproducibility scripts, the immutable primary-draft record and JSON evidence are under tools/publication/ and publication_evidence/. Glargine records PQ362993 and PQ362994 are in GenBank. Raw capillary files contain no human data; deposition details will be finalized before submission or supplied confidentially to reviewers when permitted.</w:t>
+        <w:t>The G-Synth source code, tests and documentation are available under the MIT License at https://github.com/Midotech31/g-synth-app. A versioned archival DOI will be inserted after repository release and Zenodo deposition. Reproducibility scripts, the experimental source record and JSON evidence are under tools/publication/ and publication_evidence/. Glargine records PQ362993 and PQ362994 are in GenBank. Raw capillary files contain no human data; deposition details will be finalized before submission or supplied confidentially to reviewers when permitted.</w:t>
       </w:r>
     </w:p>
     <w:p>
@@ -3440,7 +4003,7 @@
     </w:p>
     <w:p>
       <w:r>
-        <w:t>Complete designs and oligonucleotides; algorithmic invariants and executable commands; experimental and QC records; trace manifest; interface evidence; comparison notes; correction ledger; and release checklist (DOCX and PDF).</w:t>
+        <w:t>Complete designs and oligonucleotides; algorithmic invariants and executable commands; experimental and QC records; trace manifest; interface evidence; comparison data; and release checklist (DOCX and PDF).</w:t>
       </w:r>
     </w:p>
     <w:p>
@@ -3493,6 +4056,185 @@
     <w:p>
       <w:r>
         <w:t>The authors declare no competing financial interest.</w:t>
+      </w:r>
+    </w:p>
+    <w:p>
+      <w:pPr>
+        <w:pStyle w:val="Heading1"/>
+      </w:pPr>
+      <w:r>
+        <w:t>Figure Legends and Alt Text</w:t>
+      </w:r>
+    </w:p>
+    <w:p>
+      <w:r>
+        <w:rPr>
+          <w:b/>
+        </w:rPr>
+        <w:t>Figure 1.</w:t>
+      </w:r>
+      <w:r>
+        <w:t xml:space="preserve"> G-Synth workflow and software architecture. The design, build, clone and verify stages share a deterministic Python engine. The API stores project provenance and the web workspace renders the engine outputs without reimplementing biological calculations.</w:t>
+      </w:r>
+    </w:p>
+    <w:p>
+      <w:r>
+        <w:rPr>
+          <w:i/>
+        </w:rPr>
+        <w:t>Alt text: G-Synth workflow and software architecture. The design, build, clone and verify stages share a deterministic Python engine. The API stores project provenance and the web workspace renders the engine outputs without reimplementing biological calculations.</w:t>
+      </w:r>
+    </w:p>
+    <w:p>
+      <w:r>
+        <w:rPr>
+          <w:b/>
+        </w:rPr>
+        <w:t>Figure 2.</w:t>
+      </w:r>
+      <w:r>
+        <w:t xml:space="preserve"> G-Synth hybridization view after direct transfer from SSD. Both order molecules remain entered 5′→3′; the lower strand is drawn antiparallel. The 123-bp core is completely paired, while the NdeI-derived 5′-TA and XhoI-derived 5′-TCGA products remain visibly unpaired as cohesive ends.</w:t>
+      </w:r>
+    </w:p>
+    <w:p>
+      <w:r>
+        <w:rPr>
+          <w:i/>
+        </w:rPr>
+        <w:t>Alt text: G-Synth hybridization view after direct transfer from SSD. Both order molecules remain entered 5′→3′; the lower strand is drawn antiparallel. The 123-bp core is completely paired, while the NdeI-derived 5′-TA and XhoI-derived 5′-TCGA products remain visibly unpaired as cohesive ends.</w:t>
+      </w:r>
+    </w:p>
+    <w:p>
+      <w:r>
+        <w:rPr>
+          <w:b/>
+        </w:rPr>
+        <w:t>Figure 3A.</w:t>
+      </w:r>
+      <w:r>
+        <w:t xml:space="preserve"> Pre-ligation compatibility gate for the current glargine A design. G-Synth shows the 125-bp insert, the NdeI and XhoI vector–insert junctions, their opposite polarities and all six passed checks while labelling the joined sequence as expected and withholding recombinant-product analyses.</w:t>
+      </w:r>
+    </w:p>
+    <w:p>
+      <w:r>
+        <w:rPr>
+          <w:i/>
+        </w:rPr>
+        <w:t>Alt text: Pre-ligation compatibility gate for the current glargine A design. G-Synth shows the 125-bp insert, the NdeI and XhoI vector–insert junctions, their opposite polarities and all six passed checks while labelling the joined sequence as expected and withholding recombinant-product analyses.</w:t>
+      </w:r>
+    </w:p>
+    <w:p>
+      <w:r>
+        <w:rPr>
+          <w:b/>
+        </w:rPr>
+        <w:t>Figure 3B.</w:t>
+      </w:r>
+      <w:r>
+        <w:t xml:space="preserve"> Post-ligation state for the current glargine A-chain construct. A green confirmation panel reports the 5,490-bp recombinant product and shows both closed nucleotide junctions only after explicit in-silico ligation; the plasmid map, diagnostic digest, gel and exports then become available.</w:t>
+      </w:r>
+    </w:p>
+    <w:p>
+      <w:r>
+        <w:rPr>
+          <w:i/>
+        </w:rPr>
+        <w:t>Alt text: Post-ligation state for the current glargine A-chain construct. A green confirmation panel reports the 5,490-bp recombinant product and shows both closed nucleotide junctions only after explicit in-silico ligation; the plasmid map, diagnostic digest, gel and exports then become available.</w:t>
+      </w:r>
+    </w:p>
+    <w:p>
+      <w:r>
+        <w:rPr>
+          <w:b/>
+        </w:rPr>
+        <w:t>Figure 4.</w:t>
+      </w:r>
+      <w:r>
+        <w:t xml:space="preserve"> G-Synth design view for the glargine A-chain input. The release gate reports exact two-strand reconstruction, terminal-end compatibility and the NdeI start-codon note before displaying the orderable construct.</w:t>
+      </w:r>
+    </w:p>
+    <w:p>
+      <w:r>
+        <w:rPr>
+          <w:i/>
+        </w:rPr>
+        <w:t>Alt text: G-Synth design view for the glargine A-chain input. The release gate reports exact two-strand reconstruction, terminal-end compatibility and the NdeI start-codon note before displaying the orderable construct.</w:t>
+      </w:r>
+    </w:p>
+    <w:p>
+      <w:r>
+        <w:rPr>
+          <w:b/>
+        </w:rPr>
+        <w:t>Figure 5A.</w:t>
+      </w:r>
+      <w:r>
+        <w:t xml:space="preserve"> G-Synth coordinate-level view of the insulin glargine A-chain recombinant pET-21a(+) construct. Editable feature tracks, codon-aligned translation and the regenerated NdeI and XhoI junctions are shown across the circular origin.</w:t>
+      </w:r>
+    </w:p>
+    <w:p>
+      <w:r>
+        <w:rPr>
+          <w:i/>
+        </w:rPr>
+        <w:t>Alt text: G-Synth coordinate-level view of the insulin glargine A-chain recombinant pET-21a(+) construct. Editable feature tracks, codon-aligned translation and the regenerated NdeI and XhoI junctions are shown across the circular origin.</w:t>
+      </w:r>
+    </w:p>
+    <w:p>
+      <w:r>
+        <w:rPr>
+          <w:b/>
+        </w:rPr>
+        <w:t>Figure 5B.</w:t>
+      </w:r>
+      <w:r>
+        <w:t xml:space="preserve"> G-Synth coordinate-level view of the insulin glargine B-chain recombinant pET-21a(+) construct, using the same editable annotation and strand-aware coordinate system.</w:t>
+      </w:r>
+    </w:p>
+    <w:p>
+      <w:r>
+        <w:rPr>
+          <w:i/>
+        </w:rPr>
+        <w:t>Alt text: G-Synth coordinate-level view of the insulin glargine B-chain recombinant pET-21a(+) construct, using the same editable annotation and strand-aware coordinate system.</w:t>
+      </w:r>
+    </w:p>
+    <w:p>
+      <w:r>
+        <w:rPr>
+          <w:b/>
+        </w:rPr>
+        <w:t>Figure 6.</w:t>
+      </w:r>
+      <w:r>
+        <w:t xml:space="preserve"> G-Synth's interactive reference-aligned chromatogram view for representative approved A- and B-chain reads. Base calls, consensus, quality context and four-channel peaks are displayed in reference orientation.</w:t>
+      </w:r>
+    </w:p>
+    <w:p>
+      <w:r>
+        <w:rPr>
+          <w:i/>
+        </w:rPr>
+        <w:t>Alt text: G-Synth's interactive reference-aligned chromatogram view for representative approved A- and B-chain reads. Base calls, consensus, quality context and four-channel peaks are displayed in reference orientation.</w:t>
+      </w:r>
+    </w:p>
+    <w:p>
+      <w:r>
+        <w:rPr>
+          <w:b/>
+        </w:rPr>
+        <w:t>Figure 7.</w:t>
+      </w:r>
+      <w:r>
+        <w:t xml:space="preserve"> G-Synth F/R consensus validation from the four author-designated chromatograms. The oriented reads jointly cover 100% of both references with 100% consensus identity. Green shading marks bidirectional overlap (56.1% for A and 71.2% for B); every overlapping F/R call agreed.</w:t>
+      </w:r>
+    </w:p>
+    <w:p>
+      <w:r>
+        <w:rPr>
+          <w:i/>
+        </w:rPr>
+        <w:t>Alt text: G-Synth F/R consensus validation from the four author-designated chromatograms. The oriented reads jointly cover 100% of both references with 100% consensus identity. Green shading marks bidirectional overlap (56.1% for A and 71.2% for B); every overlapping F/R call agreed.</w:t>
       </w:r>
     </w:p>
     <w:p>

</xml_diff>